<commit_message>
Actualización manual de placeholders en plantillas de Word (webapp)
</commit_message>
<xml_diff>
--- a/src/main/webapp/plantillas/DESIGNACION_RESPONSABLES_PARA_ESTRUCTURAR.docx
+++ b/src/main/webapp/plantillas/DESIGNACION_RESPONSABLES_PARA_ESTRUCTURAR.docx
@@ -6,24 +6,26 @@
       <w:pPr>
         <w:jc w:val="both"/>
         <w:rPr>
-          <w:rFonts w:ascii="Arial" w:hAnsi="Arial" w:cs="Arial"/>
+          <w:rFonts w:ascii="Arial" w:eastAsia="Arial" w:hAnsi="Arial" w:cs="Arial"/>
           <w:sz w:val="24"/>
           <w:szCs w:val="24"/>
         </w:rPr>
       </w:pPr>
-      <w:bookmarkStart w:id="0" w:name="_Hlk187239535"/>
+      <w:bookmarkStart w:id="0" w:name="_GoBack"/>
+      <w:bookmarkEnd w:id="0"/>
       <w:r>
         <w:rPr>
           <w:rFonts w:ascii="Arial" w:eastAsia="Arial" w:hAnsi="Arial" w:cs="Arial"/>
           <w:sz w:val="24"/>
+          <w:szCs w:val="24"/>
         </w:rPr>
         <w:t xml:space="preserve">El Distrito Especial, Deportivo, Cultural, Turístico, Empresarial y de Servicios de Santiago de Cali Distrito Especial – Departamento Administrativo de Gestión Jurídica Pública requiere estructurar el proceso de selección Nº </w:t>
       </w:r>
       <w:r>
         <w:rPr>
-          <w:rFonts w:ascii="Arial" w:hAnsi="Arial" w:cs="Arial"/>
+          <w:rFonts w:ascii="Arial" w:eastAsia="Arial" w:hAnsi="Arial" w:cs="Arial"/>
           <w:i/>
-          <w:noProof/>
+          <w:iCs/>
           <w:sz w:val="24"/>
           <w:szCs w:val="24"/>
           <w:u w:val="single"/>
@@ -34,16 +36,24 @@
         <w:rPr>
           <w:rFonts w:ascii="Arial" w:eastAsia="Arial" w:hAnsi="Arial" w:cs="Arial"/>
           <w:sz w:val="24"/>
-        </w:rPr>
-        <w:t>, bajo la modalidad de contratación directa por la causal de prestación de servicios profesionales y/o de apoyo a la gestión, cuyo objeto es: ${OBJETO_CONTRACTUAL} Por consiguiente, se hace necesario designar los siguientes profesionales para la estructuración del proceso:</w:t>
+          <w:szCs w:val="24"/>
+        </w:rPr>
+        <w:t>, bajo la modalidad de contratación directa por la causal de prestación de servicios profesionales y/o de apoyo a la gestión, cuyo objeto es: ${OBJETO_CONTRACTUAL} Por consiguiente, se hace necesario designar los siguientes profesionales para la estructura</w:t>
       </w:r>
-    </w:p>
-    <w:bookmarkEnd w:id="0"/>
+      <w:r>
+        <w:rPr>
+          <w:rFonts w:ascii="Arial" w:eastAsia="Arial" w:hAnsi="Arial" w:cs="Arial"/>
+          <w:sz w:val="24"/>
+          <w:szCs w:val="24"/>
+        </w:rPr>
+        <w:t>ción del proceso:</w:t>
+      </w:r>
+    </w:p>
     <w:p>
       <w:pPr>
         <w:jc w:val="both"/>
         <w:rPr>
-          <w:rFonts w:ascii="Arial" w:hAnsi="Arial" w:cs="Arial"/>
+          <w:rFonts w:ascii="Arial" w:eastAsia="Arial" w:hAnsi="Arial" w:cs="Arial"/>
           <w:sz w:val="24"/>
           <w:szCs w:val="24"/>
         </w:rPr>
@@ -51,10 +61,19 @@
     </w:p>
     <w:tbl>
       <w:tblPr>
-        <w:tblStyle w:val="Tablaconcuadrcula"/>
-        <w:tblW w:w="0" w:type="auto"/>
-        <w:tblInd w:w="250" w:type="dxa"/>
-        <w:tblLook w:val="04A0" w:firstRow="1" w:lastRow="0" w:firstColumn="1" w:lastColumn="0" w:noHBand="0" w:noVBand="1"/>
+        <w:tblStyle w:val="a"/>
+        <w:tblW w:w="9372" w:type="dxa"/>
+        <w:tblInd w:w="142" w:type="dxa"/>
+        <w:tblBorders>
+          <w:top w:val="single" w:sz="4" w:space="0" w:color="000000"/>
+          <w:left w:val="single" w:sz="4" w:space="0" w:color="000000"/>
+          <w:bottom w:val="single" w:sz="4" w:space="0" w:color="000000"/>
+          <w:right w:val="single" w:sz="4" w:space="0" w:color="000000"/>
+          <w:insideH w:val="single" w:sz="4" w:space="0" w:color="000000"/>
+          <w:insideV w:val="single" w:sz="4" w:space="0" w:color="000000"/>
+        </w:tblBorders>
+        <w:tblLayout w:type="fixed"/>
+        <w:tblLook w:val="0400" w:firstRow="0" w:lastRow="0" w:firstColumn="0" w:lastColumn="0" w:noHBand="0" w:noVBand="1"/>
       </w:tblPr>
       <w:tblGrid>
         <w:gridCol w:w="4761"/>
@@ -66,73 +85,49 @@
         </w:trPr>
         <w:tc>
           <w:tcPr>
-            <w:tcW w:w="5240" w:type="dxa"/>
+            <w:tcW w:w="4761" w:type="dxa"/>
             <w:vAlign w:val="center"/>
           </w:tcPr>
           <w:p>
             <w:pPr>
               <w:jc w:val="center"/>
               <w:rPr>
-                <w:rFonts w:ascii="Arial" w:hAnsi="Arial" w:cs="Arial"/>
+                <w:rFonts w:ascii="Arial" w:eastAsia="Arial" w:hAnsi="Arial" w:cs="Arial"/>
                 <w:sz w:val="24"/>
                 <w:szCs w:val="24"/>
               </w:rPr>
             </w:pPr>
             <w:r>
               <w:rPr>
-                <w:rFonts w:ascii="Arial" w:hAnsi="Arial" w:cs="Arial"/>
-                <w:sz w:val="24"/>
-                <w:szCs w:val="24"/>
-              </w:rPr>
-              <w:t>NOMBRE COMPLE</w:t>
-            </w:r>
-            <w:r>
-              <w:rPr>
-                <w:rFonts w:ascii="Arial" w:hAnsi="Arial" w:cs="Arial"/>
-                <w:sz w:val="24"/>
-                <w:szCs w:val="24"/>
-              </w:rPr>
-              <w:t>T</w:t>
-            </w:r>
-            <w:r>
-              <w:rPr>
-                <w:rFonts w:ascii="Arial" w:hAnsi="Arial" w:cs="Arial"/>
-                <w:sz w:val="24"/>
-                <w:szCs w:val="24"/>
-              </w:rPr>
-              <w:t>O</w:t>
+                <w:rFonts w:ascii="Arial" w:eastAsia="Arial" w:hAnsi="Arial" w:cs="Arial"/>
+                <w:sz w:val="24"/>
+                <w:szCs w:val="24"/>
+              </w:rPr>
+              <w:t>NOMBRE COMPLETO</w:t>
             </w:r>
           </w:p>
         </w:tc>
         <w:tc>
           <w:tcPr>
-            <w:tcW w:w="4535" w:type="dxa"/>
+            <w:tcW w:w="4611" w:type="dxa"/>
             <w:vAlign w:val="center"/>
           </w:tcPr>
           <w:p>
             <w:pPr>
               <w:jc w:val="center"/>
               <w:rPr>
-                <w:rFonts w:ascii="Arial" w:hAnsi="Arial" w:cs="Arial"/>
+                <w:rFonts w:ascii="Arial" w:eastAsia="Arial" w:hAnsi="Arial" w:cs="Arial"/>
                 <w:sz w:val="24"/>
                 <w:szCs w:val="24"/>
               </w:rPr>
             </w:pPr>
             <w:r>
               <w:rPr>
-                <w:rFonts w:ascii="Arial" w:hAnsi="Arial" w:cs="Arial"/>
-                <w:sz w:val="24"/>
-                <w:szCs w:val="24"/>
-              </w:rPr>
-              <w:t xml:space="preserve">CARGO </w:t>
-            </w:r>
-            <w:r>
-              <w:rPr>
-                <w:rFonts w:ascii="Arial" w:hAnsi="Arial" w:cs="Arial"/>
-                <w:sz w:val="24"/>
-                <w:szCs w:val="24"/>
-              </w:rPr>
-              <w:t>o PROFESIÓN</w:t>
+                <w:rFonts w:ascii="Arial" w:eastAsia="Arial" w:hAnsi="Arial" w:cs="Arial"/>
+                <w:sz w:val="24"/>
+                <w:szCs w:val="24"/>
+              </w:rPr>
+              <w:t>CARGO o PROFESIÓN</w:t>
             </w:r>
           </w:p>
         </w:tc>
@@ -143,13 +138,13 @@
         </w:trPr>
         <w:tc>
           <w:tcPr>
-            <w:tcW w:w="5240" w:type="dxa"/>
+            <w:tcW w:w="4761" w:type="dxa"/>
             <w:vAlign w:val="center"/>
           </w:tcPr>
           <w:p>
             <w:pPr>
               <w:rPr>
-                <w:rFonts w:ascii="Arial" w:hAnsi="Arial" w:cs="Arial"/>
+                <w:rFonts w:ascii="Arial" w:eastAsia="Arial" w:hAnsi="Arial" w:cs="Arial"/>
                 <w:sz w:val="24"/>
                 <w:szCs w:val="24"/>
               </w:rPr>
@@ -158,6 +153,7 @@
               <w:rPr>
                 <w:rFonts w:ascii="Arial" w:eastAsia="Arial" w:hAnsi="Arial" w:cs="Arial"/>
                 <w:sz w:val="24"/>
+                <w:szCs w:val="24"/>
               </w:rPr>
               <w:t>${NOMBRE_ESTRUCTURADOR_JURIDICO}</w:t>
             </w:r>
@@ -165,13 +161,13 @@
         </w:tc>
         <w:tc>
           <w:tcPr>
-            <w:tcW w:w="4535" w:type="dxa"/>
+            <w:tcW w:w="4611" w:type="dxa"/>
             <w:vAlign w:val="center"/>
           </w:tcPr>
           <w:p>
             <w:pPr>
               <w:rPr>
-                <w:rFonts w:ascii="Arial" w:hAnsi="Arial" w:cs="Arial"/>
+                <w:rFonts w:ascii="Arial" w:eastAsia="Arial" w:hAnsi="Arial" w:cs="Arial"/>
                 <w:sz w:val="24"/>
                 <w:szCs w:val="24"/>
               </w:rPr>
@@ -180,6 +176,7 @@
               <w:rPr>
                 <w:rFonts w:ascii="Arial" w:eastAsia="Arial" w:hAnsi="Arial" w:cs="Arial"/>
                 <w:sz w:val="24"/>
+                <w:szCs w:val="24"/>
               </w:rPr>
               <w:t>${CARGO_ESTRUCTURADOR_JURIDICO}</w:t>
             </w:r>
@@ -192,13 +189,13 @@
         </w:trPr>
         <w:tc>
           <w:tcPr>
-            <w:tcW w:w="5240" w:type="dxa"/>
+            <w:tcW w:w="4761" w:type="dxa"/>
             <w:vAlign w:val="center"/>
           </w:tcPr>
           <w:p>
             <w:pPr>
               <w:rPr>
-                <w:rFonts w:ascii="Arial" w:hAnsi="Arial" w:cs="Arial"/>
+                <w:rFonts w:ascii="Arial" w:eastAsia="Arial" w:hAnsi="Arial" w:cs="Arial"/>
                 <w:sz w:val="24"/>
                 <w:szCs w:val="24"/>
               </w:rPr>
@@ -207,6 +204,7 @@
               <w:rPr>
                 <w:rFonts w:ascii="Arial" w:eastAsia="Arial" w:hAnsi="Arial" w:cs="Arial"/>
                 <w:sz w:val="24"/>
+                <w:szCs w:val="24"/>
               </w:rPr>
               <w:t>${NOMBRE_ESTRUCTURADOR_TECNICO}</w:t>
             </w:r>
@@ -214,13 +212,13 @@
         </w:tc>
         <w:tc>
           <w:tcPr>
-            <w:tcW w:w="4535" w:type="dxa"/>
+            <w:tcW w:w="4611" w:type="dxa"/>
             <w:vAlign w:val="center"/>
           </w:tcPr>
           <w:p>
             <w:pPr>
               <w:rPr>
-                <w:rFonts w:ascii="Arial" w:hAnsi="Arial" w:cs="Arial"/>
+                <w:rFonts w:ascii="Arial" w:eastAsia="Arial" w:hAnsi="Arial" w:cs="Arial"/>
                 <w:sz w:val="24"/>
                 <w:szCs w:val="24"/>
               </w:rPr>
@@ -229,6 +227,7 @@
               <w:rPr>
                 <w:rFonts w:ascii="Arial" w:eastAsia="Arial" w:hAnsi="Arial" w:cs="Arial"/>
                 <w:sz w:val="24"/>
+                <w:szCs w:val="24"/>
               </w:rPr>
               <w:t>${CARGO_ESTRUCTURADOR_TECNICO}</w:t>
             </w:r>
@@ -241,13 +240,13 @@
         </w:trPr>
         <w:tc>
           <w:tcPr>
-            <w:tcW w:w="5240" w:type="dxa"/>
+            <w:tcW w:w="4761" w:type="dxa"/>
             <w:vAlign w:val="center"/>
           </w:tcPr>
           <w:p>
             <w:pPr>
               <w:rPr>
-                <w:rFonts w:ascii="Arial" w:hAnsi="Arial" w:cs="Arial"/>
+                <w:rFonts w:ascii="Arial" w:eastAsia="Arial" w:hAnsi="Arial" w:cs="Arial"/>
                 <w:sz w:val="24"/>
                 <w:szCs w:val="24"/>
               </w:rPr>
@@ -256,6 +255,7 @@
               <w:rPr>
                 <w:rFonts w:ascii="Arial" w:eastAsia="Arial" w:hAnsi="Arial" w:cs="Arial"/>
                 <w:sz w:val="24"/>
+                <w:szCs w:val="24"/>
               </w:rPr>
               <w:t>${NOMBRE_ESTRUCTURADOR_FINANCIERO}</w:t>
             </w:r>
@@ -263,13 +263,13 @@
         </w:tc>
         <w:tc>
           <w:tcPr>
-            <w:tcW w:w="4535" w:type="dxa"/>
+            <w:tcW w:w="4611" w:type="dxa"/>
             <w:vAlign w:val="center"/>
           </w:tcPr>
           <w:p>
             <w:pPr>
               <w:rPr>
-                <w:rFonts w:ascii="Arial" w:hAnsi="Arial" w:cs="Arial"/>
+                <w:rFonts w:ascii="Arial" w:eastAsia="Arial" w:hAnsi="Arial" w:cs="Arial"/>
                 <w:sz w:val="24"/>
                 <w:szCs w:val="24"/>
               </w:rPr>
@@ -278,6 +278,7 @@
               <w:rPr>
                 <w:rFonts w:ascii="Arial" w:eastAsia="Arial" w:hAnsi="Arial" w:cs="Arial"/>
                 <w:sz w:val="24"/>
+                <w:szCs w:val="24"/>
               </w:rPr>
               <w:t>${CARGO_ESTRUCTURADOR_FINANCIERO}</w:t>
             </w:r>
@@ -289,7 +290,7 @@
       <w:pPr>
         <w:jc w:val="both"/>
         <w:rPr>
-          <w:rFonts w:ascii="Arial" w:hAnsi="Arial" w:cs="Arial"/>
+          <w:rFonts w:ascii="Arial" w:eastAsia="Arial" w:hAnsi="Arial" w:cs="Arial"/>
           <w:sz w:val="24"/>
           <w:szCs w:val="24"/>
         </w:rPr>
@@ -299,7 +300,7 @@
       <w:pPr>
         <w:jc w:val="both"/>
         <w:rPr>
-          <w:rFonts w:ascii="Arial" w:hAnsi="Arial" w:cs="Arial"/>
+          <w:rFonts w:ascii="Arial" w:eastAsia="Arial" w:hAnsi="Arial" w:cs="Arial"/>
           <w:sz w:val="24"/>
           <w:szCs w:val="24"/>
         </w:rPr>
@@ -308,6 +309,7 @@
         <w:rPr>
           <w:rFonts w:ascii="Arial" w:eastAsia="Arial" w:hAnsi="Arial" w:cs="Arial"/>
           <w:sz w:val="24"/>
+          <w:szCs w:val="24"/>
         </w:rPr>
         <w:t>Para adelantar los trámites necesarios, el ${CARGO_ESTRUCTURADOR_FINANCIERO} del Departamento que brindará apoyo es: ${NOMBRE_ESTRUCTURADOR_FINANCIERO}</w:t>
       </w:r>
@@ -315,7 +317,7 @@
     <w:p>
       <w:pPr>
         <w:rPr>
-          <w:rFonts w:ascii="Arial" w:hAnsi="Arial" w:cs="Arial"/>
+          <w:rFonts w:ascii="Arial" w:eastAsia="Arial" w:hAnsi="Arial" w:cs="Arial"/>
           <w:sz w:val="24"/>
           <w:szCs w:val="24"/>
         </w:rPr>
@@ -324,7 +326,7 @@
     <w:p>
       <w:pPr>
         <w:rPr>
-          <w:rFonts w:ascii="Arial" w:hAnsi="Arial" w:cs="Arial"/>
+          <w:rFonts w:ascii="Arial" w:eastAsia="Arial" w:hAnsi="Arial" w:cs="Arial"/>
           <w:sz w:val="24"/>
           <w:szCs w:val="24"/>
         </w:rPr>
@@ -334,7 +336,7 @@
       <w:pPr>
         <w:jc w:val="both"/>
         <w:rPr>
-          <w:rFonts w:ascii="Arial" w:hAnsi="Arial" w:cs="Arial"/>
+          <w:rFonts w:ascii="Arial" w:eastAsia="Arial" w:hAnsi="Arial" w:cs="Arial"/>
           <w:sz w:val="24"/>
           <w:szCs w:val="24"/>
         </w:rPr>
@@ -343,6 +345,7 @@
         <w:rPr>
           <w:rFonts w:ascii="Arial" w:eastAsia="Arial" w:hAnsi="Arial" w:cs="Arial"/>
           <w:sz w:val="24"/>
+          <w:szCs w:val="24"/>
         </w:rPr>
         <w:t>Se firma en Santiago de Cali, a los ${FECHA_DOCUMENTO_LETRAS}.</w:t>
       </w:r>
@@ -350,7 +353,7 @@
     <w:p>
       <w:pPr>
         <w:rPr>
-          <w:rFonts w:ascii="Arial" w:hAnsi="Arial" w:cs="Arial"/>
+          <w:rFonts w:ascii="Arial" w:eastAsia="Arial" w:hAnsi="Arial" w:cs="Arial"/>
           <w:sz w:val="24"/>
           <w:szCs w:val="24"/>
         </w:rPr>
@@ -359,7 +362,7 @@
     <w:p>
       <w:pPr>
         <w:rPr>
-          <w:rFonts w:ascii="Arial" w:hAnsi="Arial" w:cs="Arial"/>
+          <w:rFonts w:ascii="Arial" w:eastAsia="Arial" w:hAnsi="Arial" w:cs="Arial"/>
           <w:sz w:val="24"/>
           <w:szCs w:val="24"/>
         </w:rPr>
@@ -368,34 +371,43 @@
     <w:p>
       <w:pPr>
         <w:rPr>
-          <w:rFonts w:ascii="Arial" w:hAnsi="Arial" w:cs="Arial"/>
+          <w:rFonts w:ascii="Arial" w:eastAsia="Arial" w:hAnsi="Arial" w:cs="Arial"/>
           <w:sz w:val="24"/>
           <w:szCs w:val="24"/>
         </w:rPr>
       </w:pPr>
-      <w:bookmarkStart w:id="1" w:name="_Hlk187245736"/>
+      <w:bookmarkStart w:id="1" w:name="_bx3kilpe4v90" w:colFirst="0" w:colLast="0"/>
+      <w:bookmarkEnd w:id="1"/>
       <w:r>
         <w:rPr>
-          <w:rFonts w:ascii="Arial" w:hAnsi="Arial" w:cs="Arial"/>
-          <w:sz w:val="24"/>
-          <w:szCs w:val="24"/>
-        </w:rPr>
-        <w:t>______________________________________</w:t>
+          <w:rFonts w:ascii="Arial" w:eastAsia="Arial" w:hAnsi="Arial" w:cs="Arial"/>
+          <w:sz w:val="24"/>
+          <w:szCs w:val="24"/>
+        </w:rPr>
+        <w:t>_____________________________________</w:t>
       </w:r>
-    </w:p>
-    <w:bookmarkEnd w:id="1"/>
+      <w:r>
+        <w:rPr>
+          <w:rFonts w:ascii="Arial" w:eastAsia="Arial" w:hAnsi="Arial" w:cs="Arial"/>
+          <w:sz w:val="24"/>
+          <w:szCs w:val="24"/>
+        </w:rPr>
+        <w:t>_</w:t>
+      </w:r>
+    </w:p>
     <w:p>
       <w:pPr>
         <w:rPr>
-          <w:rFonts w:ascii="Arial" w:hAnsi="Arial" w:cs="Arial"/>
+          <w:rFonts w:ascii="Arial" w:eastAsia="Arial" w:hAnsi="Arial" w:cs="Arial"/>
           <w:i/>
+          <w:iCs/>
           <w:sz w:val="24"/>
           <w:szCs w:val="24"/>
         </w:rPr>
       </w:pPr>
       <w:r>
         <w:rPr>
-          <w:rFonts w:ascii="Arial" w:hAnsi="Arial" w:cs="Arial"/>
+          <w:rFonts w:ascii="Arial" w:eastAsia="Arial" w:hAnsi="Arial" w:cs="Arial"/>
           <w:sz w:val="24"/>
           <w:szCs w:val="24"/>
         </w:rPr>
@@ -405,7 +417,7 @@
     <w:p>
       <w:pPr>
         <w:rPr>
-          <w:rFonts w:ascii="Arial" w:hAnsi="Arial" w:cs="Arial"/>
+          <w:rFonts w:ascii="Arial" w:eastAsia="Arial" w:hAnsi="Arial" w:cs="Arial"/>
           <w:sz w:val="24"/>
           <w:szCs w:val="24"/>
         </w:rPr>
@@ -414,6 +426,7 @@
         <w:rPr>
           <w:rFonts w:ascii="Arial" w:eastAsia="Arial" w:hAnsi="Arial" w:cs="Arial"/>
           <w:sz w:val="24"/>
+          <w:szCs w:val="24"/>
         </w:rPr>
         <w:t>Nombre: ${NOMBRE_ORDENADOR}</w:t>
       </w:r>
@@ -421,7 +434,7 @@
     <w:p>
       <w:pPr>
         <w:rPr>
-          <w:rFonts w:ascii="Arial" w:hAnsi="Arial" w:cs="Arial"/>
+          <w:rFonts w:ascii="Arial" w:eastAsia="Arial" w:hAnsi="Arial" w:cs="Arial"/>
           <w:sz w:val="24"/>
           <w:szCs w:val="24"/>
         </w:rPr>
@@ -430,6 +443,7 @@
         <w:rPr>
           <w:rFonts w:ascii="Arial" w:eastAsia="Arial" w:hAnsi="Arial" w:cs="Arial"/>
           <w:sz w:val="24"/>
+          <w:szCs w:val="24"/>
         </w:rPr>
         <w:t>Cargo: ${CARGO_ORDENADOR}</w:t>
       </w:r>
@@ -437,7 +451,7 @@
     <w:p>
       <w:pPr>
         <w:rPr>
-          <w:rFonts w:ascii="Arial" w:hAnsi="Arial" w:cs="Arial"/>
+          <w:rFonts w:ascii="Arial" w:eastAsia="Arial" w:hAnsi="Arial" w:cs="Arial"/>
           <w:sz w:val="24"/>
           <w:szCs w:val="24"/>
         </w:rPr>
@@ -446,7 +460,7 @@
     <w:p>
       <w:pPr>
         <w:rPr>
-          <w:rFonts w:ascii="Arial" w:hAnsi="Arial" w:cs="Arial"/>
+          <w:rFonts w:ascii="Arial" w:eastAsia="Arial" w:hAnsi="Arial" w:cs="Arial"/>
           <w:sz w:val="24"/>
           <w:szCs w:val="24"/>
         </w:rPr>
@@ -455,7 +469,7 @@
     <w:p>
       <w:pPr>
         <w:rPr>
-          <w:rFonts w:ascii="Arial" w:hAnsi="Arial" w:cs="Arial"/>
+          <w:rFonts w:ascii="Arial" w:eastAsia="Arial" w:hAnsi="Arial" w:cs="Arial"/>
           <w:sz w:val="24"/>
           <w:szCs w:val="24"/>
         </w:rPr>
@@ -464,7 +478,7 @@
     <w:p>
       <w:pPr>
         <w:rPr>
-          <w:rFonts w:ascii="Arial" w:hAnsi="Arial" w:cs="Arial"/>
+          <w:rFonts w:ascii="Arial" w:eastAsia="Arial" w:hAnsi="Arial" w:cs="Arial"/>
           <w:sz w:val="24"/>
           <w:szCs w:val="24"/>
         </w:rPr>
@@ -473,7 +487,7 @@
     <w:p>
       <w:pPr>
         <w:rPr>
-          <w:rFonts w:ascii="Arial" w:hAnsi="Arial" w:cs="Arial"/>
+          <w:rFonts w:ascii="Arial" w:eastAsia="Arial" w:hAnsi="Arial" w:cs="Arial"/>
           <w:sz w:val="24"/>
           <w:szCs w:val="24"/>
         </w:rPr>
@@ -482,7 +496,7 @@
     <w:p>
       <w:pPr>
         <w:rPr>
-          <w:rFonts w:ascii="Arial" w:hAnsi="Arial" w:cs="Arial"/>
+          <w:rFonts w:ascii="Arial" w:eastAsia="Arial" w:hAnsi="Arial" w:cs="Arial"/>
           <w:sz w:val="24"/>
           <w:szCs w:val="24"/>
         </w:rPr>
@@ -491,7 +505,7 @@
     <w:p>
       <w:pPr>
         <w:rPr>
-          <w:rFonts w:ascii="Arial" w:hAnsi="Arial" w:cs="Arial"/>
+          <w:rFonts w:ascii="Arial" w:eastAsia="Arial" w:hAnsi="Arial" w:cs="Arial"/>
           <w:sz w:val="24"/>
           <w:szCs w:val="24"/>
         </w:rPr>
@@ -500,32 +514,24 @@
     <w:p>
       <w:pPr>
         <w:rPr>
-          <w:rFonts w:ascii="Arial" w:hAnsi="Arial" w:cs="Arial"/>
+          <w:rFonts w:ascii="Arial" w:eastAsia="Arial" w:hAnsi="Arial" w:cs="Arial"/>
           <w:sz w:val="24"/>
           <w:szCs w:val="24"/>
         </w:rPr>
       </w:pPr>
       <w:r>
         <w:rPr>
-          <w:rFonts w:ascii="Arial" w:hAnsi="Arial" w:cs="Arial"/>
-          <w:sz w:val="24"/>
-          <w:szCs w:val="24"/>
-        </w:rPr>
-        <w:t>Enterado</w:t>
+          <w:rFonts w:ascii="Arial" w:eastAsia="Arial" w:hAnsi="Arial" w:cs="Arial"/>
+          <w:sz w:val="24"/>
+          <w:szCs w:val="24"/>
+        </w:rPr>
+        <w:t>Enterado(s)</w:t>
       </w:r>
-      <w:r>
-        <w:rPr>
-          <w:rFonts w:ascii="Arial" w:hAnsi="Arial" w:cs="Arial"/>
-          <w:sz w:val="24"/>
-          <w:szCs w:val="24"/>
-        </w:rPr>
-        <w:t>(s)</w:t>
-      </w:r>
     </w:p>
     <w:p>
       <w:pPr>
         <w:rPr>
-          <w:rFonts w:ascii="Arial" w:hAnsi="Arial" w:cs="Arial"/>
+          <w:rFonts w:ascii="Arial" w:eastAsia="Arial" w:hAnsi="Arial" w:cs="Arial"/>
           <w:sz w:val="24"/>
           <w:szCs w:val="24"/>
         </w:rPr>
@@ -534,7 +540,7 @@
     <w:p>
       <w:pPr>
         <w:rPr>
-          <w:rFonts w:ascii="Arial" w:hAnsi="Arial" w:cs="Arial"/>
+          <w:rFonts w:ascii="Arial" w:eastAsia="Arial" w:hAnsi="Arial" w:cs="Arial"/>
           <w:sz w:val="24"/>
           <w:szCs w:val="24"/>
         </w:rPr>
@@ -543,7 +549,7 @@
     <w:p>
       <w:pPr>
         <w:rPr>
-          <w:rFonts w:ascii="Arial" w:hAnsi="Arial" w:cs="Arial"/>
+          <w:rFonts w:ascii="Arial" w:eastAsia="Arial" w:hAnsi="Arial" w:cs="Arial"/>
           <w:sz w:val="24"/>
           <w:szCs w:val="24"/>
         </w:rPr>
@@ -552,7 +558,7 @@
     <w:p>
       <w:pPr>
         <w:rPr>
-          <w:rFonts w:ascii="Arial" w:hAnsi="Arial" w:cs="Arial"/>
+          <w:rFonts w:ascii="Arial" w:eastAsia="Arial" w:hAnsi="Arial" w:cs="Arial"/>
           <w:sz w:val="24"/>
           <w:szCs w:val="24"/>
         </w:rPr>
@@ -560,15 +566,19 @@
     </w:p>
     <w:tbl>
       <w:tblPr>
-        <w:tblStyle w:val="Tablaconcuadrcula"/>
-        <w:tblW w:w="0" w:type="auto"/>
+        <w:tblStyle w:val="a0"/>
+        <w:tblW w:w="6215" w:type="dxa"/>
+        <w:tblInd w:w="-108" w:type="dxa"/>
         <w:tblBorders>
-          <w:left w:val="none" w:sz="0" w:space="0" w:color="auto"/>
-          <w:bottom w:val="none" w:sz="0" w:space="0" w:color="auto"/>
-          <w:right w:val="none" w:sz="0" w:space="0" w:color="auto"/>
-          <w:insideH w:val="none" w:sz="0" w:space="0" w:color="auto"/>
+          <w:top w:val="single" w:sz="4" w:space="0" w:color="000000"/>
+          <w:left w:val="nil"/>
+          <w:bottom w:val="nil"/>
+          <w:right w:val="nil"/>
+          <w:insideH w:val="nil"/>
+          <w:insideV w:val="single" w:sz="4" w:space="0" w:color="000000"/>
         </w:tblBorders>
-        <w:tblLook w:val="04A0" w:firstRow="1" w:lastRow="0" w:firstColumn="1" w:lastColumn="0" w:noHBand="0" w:noVBand="1"/>
+        <w:tblLayout w:type="fixed"/>
+        <w:tblLook w:val="0400" w:firstRow="0" w:lastRow="0" w:firstColumn="0" w:lastColumn="0" w:noHBand="0" w:noVBand="1"/>
       </w:tblPr>
       <w:tblGrid>
         <w:gridCol w:w="5626"/>
@@ -586,7 +596,7 @@
           <w:tcPr>
             <w:tcW w:w="5626" w:type="dxa"/>
             <w:tcBorders>
-              <w:top w:val="single" w:sz="4" w:space="0" w:color="auto"/>
+              <w:top w:val="single" w:sz="4" w:space="0" w:color="000000"/>
               <w:left w:val="nil"/>
               <w:bottom w:val="nil"/>
               <w:right w:val="nil"/>
@@ -596,33 +606,25 @@
             <w:pPr>
               <w:ind w:left="-108"/>
               <w:rPr>
-                <w:rFonts w:ascii="Arial" w:hAnsi="Arial" w:cs="Arial"/>
+                <w:rFonts w:ascii="Arial" w:eastAsia="Arial" w:hAnsi="Arial" w:cs="Arial"/>
                 <w:sz w:val="24"/>
                 <w:szCs w:val="24"/>
               </w:rPr>
             </w:pPr>
             <w:r>
               <w:rPr>
-                <w:rFonts w:ascii="Arial" w:hAnsi="Arial" w:cs="Arial"/>
-                <w:sz w:val="24"/>
-                <w:szCs w:val="24"/>
-              </w:rPr>
-              <w:t>Firma del profesional</w:t>
-            </w:r>
-            <w:r>
-              <w:rPr>
-                <w:rFonts w:ascii="Arial" w:hAnsi="Arial" w:cs="Arial"/>
-                <w:sz w:val="24"/>
-                <w:szCs w:val="24"/>
-              </w:rPr>
-              <w:t xml:space="preserve"> Jurídico</w:t>
+                <w:rFonts w:ascii="Arial" w:eastAsia="Arial" w:hAnsi="Arial" w:cs="Arial"/>
+                <w:sz w:val="24"/>
+                <w:szCs w:val="24"/>
+              </w:rPr>
+              <w:t>Firma del profesional Jurídico</w:t>
             </w:r>
           </w:p>
           <w:p>
             <w:pPr>
               <w:ind w:left="-108"/>
               <w:rPr>
-                <w:rFonts w:ascii="Arial" w:hAnsi="Arial" w:cs="Arial"/>
+                <w:rFonts w:ascii="Arial" w:eastAsia="Arial" w:hAnsi="Arial" w:cs="Arial"/>
                 <w:sz w:val="24"/>
                 <w:szCs w:val="24"/>
               </w:rPr>
@@ -631,6 +633,7 @@
               <w:rPr>
                 <w:rFonts w:ascii="Arial" w:eastAsia="Arial" w:hAnsi="Arial" w:cs="Arial"/>
                 <w:sz w:val="24"/>
+                <w:szCs w:val="24"/>
               </w:rPr>
               <w:t>Nombre: ${NOMBRE_ESTRUCTURADOR_JURIDICO}</w:t>
             </w:r>
@@ -639,7 +642,7 @@
             <w:pPr>
               <w:ind w:left="-108"/>
               <w:rPr>
-                <w:rFonts w:ascii="Arial" w:hAnsi="Arial" w:cs="Arial"/>
+                <w:rFonts w:ascii="Arial" w:eastAsia="Arial" w:hAnsi="Arial" w:cs="Arial"/>
                 <w:sz w:val="24"/>
                 <w:szCs w:val="24"/>
               </w:rPr>
@@ -648,6 +651,7 @@
               <w:rPr>
                 <w:rFonts w:ascii="Arial" w:eastAsia="Arial" w:hAnsi="Arial" w:cs="Arial"/>
                 <w:sz w:val="24"/>
+                <w:szCs w:val="24"/>
               </w:rPr>
               <w:t>Fecha: ${FECHA_DOCUMENTO}</w:t>
             </w:r>
@@ -656,7 +660,7 @@
             <w:pPr>
               <w:ind w:left="-108"/>
               <w:rPr>
-                <w:rFonts w:ascii="Arial" w:hAnsi="Arial" w:cs="Arial"/>
+                <w:rFonts w:ascii="Arial" w:eastAsia="Arial" w:hAnsi="Arial" w:cs="Arial"/>
                 <w:sz w:val="24"/>
                 <w:szCs w:val="24"/>
               </w:rPr>
@@ -666,7 +670,7 @@
             <w:pPr>
               <w:ind w:left="-108"/>
               <w:rPr>
-                <w:rFonts w:ascii="Arial" w:hAnsi="Arial" w:cs="Arial"/>
+                <w:rFonts w:ascii="Arial" w:eastAsia="Arial" w:hAnsi="Arial" w:cs="Arial"/>
                 <w:sz w:val="24"/>
                 <w:szCs w:val="24"/>
               </w:rPr>
@@ -687,7 +691,7 @@
           <w:p>
             <w:pPr>
               <w:rPr>
-                <w:rFonts w:ascii="Arial" w:hAnsi="Arial" w:cs="Arial"/>
+                <w:rFonts w:ascii="Arial" w:eastAsia="Arial" w:hAnsi="Arial" w:cs="Arial"/>
                 <w:sz w:val="24"/>
                 <w:szCs w:val="24"/>
               </w:rPr>
@@ -704,7 +708,7 @@
             <w:tcW w:w="5882" w:type="dxa"/>
             <w:gridSpan w:val="2"/>
             <w:tcBorders>
-              <w:top w:val="single" w:sz="4" w:space="0" w:color="auto"/>
+              <w:top w:val="single" w:sz="4" w:space="0" w:color="000000"/>
               <w:left w:val="nil"/>
               <w:bottom w:val="nil"/>
               <w:right w:val="nil"/>
@@ -714,33 +718,25 @@
             <w:pPr>
               <w:ind w:left="-108"/>
               <w:rPr>
-                <w:rFonts w:ascii="Arial" w:hAnsi="Arial" w:cs="Arial"/>
+                <w:rFonts w:ascii="Arial" w:eastAsia="Arial" w:hAnsi="Arial" w:cs="Arial"/>
                 <w:sz w:val="24"/>
                 <w:szCs w:val="24"/>
               </w:rPr>
             </w:pPr>
             <w:r>
               <w:rPr>
-                <w:rFonts w:ascii="Arial" w:hAnsi="Arial" w:cs="Arial"/>
-                <w:sz w:val="24"/>
-                <w:szCs w:val="24"/>
-              </w:rPr>
-              <w:t>Firma del profesional</w:t>
-            </w:r>
-            <w:r>
-              <w:rPr>
-                <w:rFonts w:ascii="Arial" w:hAnsi="Arial" w:cs="Arial"/>
-                <w:sz w:val="24"/>
-                <w:szCs w:val="24"/>
-              </w:rPr>
-              <w:t xml:space="preserve"> Técnico</w:t>
+                <w:rFonts w:ascii="Arial" w:eastAsia="Arial" w:hAnsi="Arial" w:cs="Arial"/>
+                <w:sz w:val="24"/>
+                <w:szCs w:val="24"/>
+              </w:rPr>
+              <w:t>Firma del profesional Técnico</w:t>
             </w:r>
           </w:p>
           <w:p>
             <w:pPr>
               <w:ind w:left="-108"/>
               <w:rPr>
-                <w:rFonts w:ascii="Arial" w:hAnsi="Arial" w:cs="Arial"/>
+                <w:rFonts w:ascii="Arial" w:eastAsia="Arial" w:hAnsi="Arial" w:cs="Arial"/>
                 <w:sz w:val="24"/>
                 <w:szCs w:val="24"/>
               </w:rPr>
@@ -749,6 +745,7 @@
               <w:rPr>
                 <w:rFonts w:ascii="Arial" w:eastAsia="Arial" w:hAnsi="Arial" w:cs="Arial"/>
                 <w:sz w:val="24"/>
+                <w:szCs w:val="24"/>
               </w:rPr>
               <w:t>Nombre: ${NOMBRE_ESTRUCTURADOR_TECNICO}</w:t>
             </w:r>
@@ -757,7 +754,7 @@
             <w:pPr>
               <w:ind w:left="-108"/>
               <w:rPr>
-                <w:rFonts w:ascii="Arial" w:hAnsi="Arial" w:cs="Arial"/>
+                <w:rFonts w:ascii="Arial" w:eastAsia="Arial" w:hAnsi="Arial" w:cs="Arial"/>
                 <w:sz w:val="24"/>
                 <w:szCs w:val="24"/>
               </w:rPr>
@@ -766,6 +763,7 @@
               <w:rPr>
                 <w:rFonts w:ascii="Arial" w:eastAsia="Arial" w:hAnsi="Arial" w:cs="Arial"/>
                 <w:sz w:val="24"/>
+                <w:szCs w:val="24"/>
               </w:rPr>
               <w:t>Fecha: ${FECHA_DOCUMENTO}</w:t>
             </w:r>
@@ -774,7 +772,7 @@
             <w:pPr>
               <w:ind w:left="-108"/>
               <w:rPr>
-                <w:rFonts w:ascii="Arial" w:hAnsi="Arial" w:cs="Arial"/>
+                <w:rFonts w:ascii="Arial" w:eastAsia="Arial" w:hAnsi="Arial" w:cs="Arial"/>
                 <w:sz w:val="24"/>
                 <w:szCs w:val="24"/>
               </w:rPr>
@@ -783,7 +781,7 @@
           <w:p>
             <w:pPr>
               <w:rPr>
-                <w:rFonts w:ascii="Arial" w:hAnsi="Arial" w:cs="Arial"/>
+                <w:rFonts w:ascii="Arial" w:eastAsia="Arial" w:hAnsi="Arial" w:cs="Arial"/>
                 <w:sz w:val="24"/>
                 <w:szCs w:val="24"/>
               </w:rPr>
@@ -793,7 +791,7 @@
             <w:pPr>
               <w:ind w:left="-108"/>
               <w:rPr>
-                <w:rFonts w:ascii="Arial" w:hAnsi="Arial" w:cs="Arial"/>
+                <w:rFonts w:ascii="Arial" w:eastAsia="Arial" w:hAnsi="Arial" w:cs="Arial"/>
                 <w:sz w:val="24"/>
                 <w:szCs w:val="24"/>
               </w:rPr>
@@ -814,7 +812,7 @@
           <w:p>
             <w:pPr>
               <w:rPr>
-                <w:rFonts w:ascii="Arial" w:hAnsi="Arial" w:cs="Arial"/>
+                <w:rFonts w:ascii="Arial" w:eastAsia="Arial" w:hAnsi="Arial" w:cs="Arial"/>
                 <w:sz w:val="24"/>
                 <w:szCs w:val="24"/>
               </w:rPr>
@@ -826,7 +824,7 @@
     <w:p>
       <w:pPr>
         <w:rPr>
-          <w:rFonts w:ascii="Arial" w:hAnsi="Arial" w:cs="Arial"/>
+          <w:rFonts w:ascii="Arial" w:eastAsia="Arial" w:hAnsi="Arial" w:cs="Arial"/>
           <w:sz w:val="24"/>
           <w:szCs w:val="24"/>
         </w:rPr>
@@ -834,15 +832,19 @@
     </w:p>
     <w:tbl>
       <w:tblPr>
-        <w:tblStyle w:val="Tablaconcuadrcula"/>
-        <w:tblW w:w="0" w:type="auto"/>
+        <w:tblStyle w:val="a1"/>
+        <w:tblW w:w="6075" w:type="dxa"/>
+        <w:tblInd w:w="-108" w:type="dxa"/>
         <w:tblBorders>
-          <w:left w:val="none" w:sz="0" w:space="0" w:color="auto"/>
-          <w:bottom w:val="none" w:sz="0" w:space="0" w:color="auto"/>
-          <w:right w:val="none" w:sz="0" w:space="0" w:color="auto"/>
-          <w:insideH w:val="none" w:sz="0" w:space="0" w:color="auto"/>
+          <w:top w:val="single" w:sz="4" w:space="0" w:color="000000"/>
+          <w:left w:val="nil"/>
+          <w:bottom w:val="nil"/>
+          <w:right w:val="nil"/>
+          <w:insideH w:val="nil"/>
+          <w:insideV w:val="single" w:sz="4" w:space="0" w:color="000000"/>
         </w:tblBorders>
-        <w:tblLook w:val="04A0" w:firstRow="1" w:lastRow="0" w:firstColumn="1" w:lastColumn="0" w:noHBand="0" w:noVBand="1"/>
+        <w:tblLayout w:type="fixed"/>
+        <w:tblLook w:val="0400" w:firstRow="0" w:lastRow="0" w:firstColumn="0" w:lastColumn="0" w:noHBand="0" w:noVBand="1"/>
       </w:tblPr>
       <w:tblGrid>
         <w:gridCol w:w="5752"/>
@@ -856,7 +858,7 @@
           <w:tcPr>
             <w:tcW w:w="5752" w:type="dxa"/>
             <w:tcBorders>
-              <w:top w:val="single" w:sz="4" w:space="0" w:color="auto"/>
+              <w:top w:val="single" w:sz="4" w:space="0" w:color="000000"/>
               <w:left w:val="nil"/>
               <w:bottom w:val="nil"/>
               <w:right w:val="nil"/>
@@ -866,33 +868,25 @@
             <w:pPr>
               <w:ind w:left="-108"/>
               <w:rPr>
-                <w:rFonts w:ascii="Arial" w:hAnsi="Arial" w:cs="Arial"/>
+                <w:rFonts w:ascii="Arial" w:eastAsia="Arial" w:hAnsi="Arial" w:cs="Arial"/>
                 <w:sz w:val="24"/>
                 <w:szCs w:val="24"/>
               </w:rPr>
             </w:pPr>
             <w:r>
               <w:rPr>
-                <w:rFonts w:ascii="Arial" w:hAnsi="Arial" w:cs="Arial"/>
-                <w:sz w:val="24"/>
-                <w:szCs w:val="24"/>
-              </w:rPr>
-              <w:t>Firma del profesional</w:t>
-            </w:r>
-            <w:r>
-              <w:rPr>
-                <w:rFonts w:ascii="Arial" w:hAnsi="Arial" w:cs="Arial"/>
-                <w:sz w:val="24"/>
-                <w:szCs w:val="24"/>
-              </w:rPr>
-              <w:t xml:space="preserve"> Financiero</w:t>
+                <w:rFonts w:ascii="Arial" w:eastAsia="Arial" w:hAnsi="Arial" w:cs="Arial"/>
+                <w:sz w:val="24"/>
+                <w:szCs w:val="24"/>
+              </w:rPr>
+              <w:t>Firma del profesional Financiero</w:t>
             </w:r>
           </w:p>
           <w:p>
             <w:pPr>
               <w:ind w:left="-108"/>
               <w:rPr>
-                <w:rFonts w:ascii="Arial" w:hAnsi="Arial" w:cs="Arial"/>
+                <w:rFonts w:ascii="Arial" w:eastAsia="Arial" w:hAnsi="Arial" w:cs="Arial"/>
                 <w:sz w:val="24"/>
                 <w:szCs w:val="24"/>
               </w:rPr>
@@ -901,6 +895,7 @@
               <w:rPr>
                 <w:rFonts w:ascii="Arial" w:eastAsia="Arial" w:hAnsi="Arial" w:cs="Arial"/>
                 <w:sz w:val="24"/>
+                <w:szCs w:val="24"/>
               </w:rPr>
               <w:t>Nombre: ${NOMBRE_ESTRUCTURADOR_FINANCIERO}</w:t>
             </w:r>
@@ -909,7 +904,7 @@
             <w:pPr>
               <w:ind w:left="-108"/>
               <w:rPr>
-                <w:rFonts w:ascii="Arial" w:hAnsi="Arial" w:cs="Arial"/>
+                <w:rFonts w:ascii="Arial" w:eastAsia="Arial" w:hAnsi="Arial" w:cs="Arial"/>
                 <w:sz w:val="24"/>
                 <w:szCs w:val="24"/>
               </w:rPr>
@@ -918,6 +913,7 @@
               <w:rPr>
                 <w:rFonts w:ascii="Arial" w:eastAsia="Arial" w:hAnsi="Arial" w:cs="Arial"/>
                 <w:sz w:val="24"/>
+                <w:szCs w:val="24"/>
               </w:rPr>
               <w:t>Fecha: ${FECHA_DOCUMENTO}</w:t>
             </w:r>
@@ -926,8 +922,7 @@
             <w:pPr>
               <w:ind w:left="-108"/>
               <w:rPr>
-                <w:rFonts w:ascii="Arial" w:hAnsi="Arial" w:cs="Arial"/>
-                <w:noProof/>
+                <w:rFonts w:ascii="Arial" w:eastAsia="Arial" w:hAnsi="Arial" w:cs="Arial"/>
                 <w:sz w:val="24"/>
                 <w:szCs w:val="24"/>
               </w:rPr>
@@ -936,7 +931,7 @@
           <w:p>
             <w:pPr>
               <w:rPr>
-                <w:rFonts w:ascii="Arial" w:hAnsi="Arial" w:cs="Arial"/>
+                <w:rFonts w:ascii="Arial" w:eastAsia="Arial" w:hAnsi="Arial" w:cs="Arial"/>
                 <w:sz w:val="24"/>
                 <w:szCs w:val="24"/>
               </w:rPr>
@@ -946,7 +941,7 @@
             <w:pPr>
               <w:ind w:left="-108"/>
               <w:rPr>
-                <w:rFonts w:ascii="Arial" w:hAnsi="Arial" w:cs="Arial"/>
+                <w:rFonts w:ascii="Arial" w:eastAsia="Arial" w:hAnsi="Arial" w:cs="Arial"/>
                 <w:sz w:val="24"/>
                 <w:szCs w:val="24"/>
               </w:rPr>
@@ -966,7 +961,7 @@
           <w:p>
             <w:pPr>
               <w:rPr>
-                <w:rFonts w:ascii="Arial" w:hAnsi="Arial" w:cs="Arial"/>
+                <w:rFonts w:ascii="Arial" w:eastAsia="Arial" w:hAnsi="Arial" w:cs="Arial"/>
                 <w:sz w:val="24"/>
                 <w:szCs w:val="24"/>
               </w:rPr>
@@ -989,55 +984,42 @@
           <w:sz w:val="16"/>
           <w:szCs w:val="16"/>
         </w:rPr>
-        <w:t xml:space="preserve">Proyectó: </w:t>
+        <w:t>Proyectó: ${NOMBRE_PROYECTO} – ${CARGO_PROYECTO}</w:t>
       </w:r>
+    </w:p>
+    <w:p>
+      <w:pPr>
+        <w:rPr>
+          <w:rFonts w:ascii="Arial" w:eastAsia="Arial" w:hAnsi="Arial" w:cs="Arial"/>
+          <w:sz w:val="24"/>
+          <w:szCs w:val="24"/>
+        </w:rPr>
+      </w:pPr>
+      <w:bookmarkStart w:id="2" w:name="_hflz8z4mtsqa" w:colFirst="0" w:colLast="0"/>
+      <w:bookmarkEnd w:id="2"/>
       <w:r>
         <w:rPr>
           <w:rFonts w:ascii="Arial" w:eastAsia="Arial" w:hAnsi="Arial" w:cs="Arial"/>
           <w:sz w:val="16"/>
           <w:szCs w:val="16"/>
         </w:rPr>
-        <w:t>${NOMBRE_PROYECTO} – ${CARGO_PROYECTO}</w:t>
+        <w:t>Revisó: ${NOMBRE_REVISO} – ${CARGO_REVISO}</w:t>
       </w:r>
-    </w:p>
-    <w:p>
-      <w:pPr>
-        <w:rPr>
-          <w:rFonts w:ascii="Arial" w:eastAsia="Arial" w:hAnsi="Arial" w:cs="Arial"/>
-          <w:sz w:val="24"/>
-          <w:szCs w:val="24"/>
-        </w:rPr>
-      </w:pPr>
-      <w:r>
-        <w:rPr>
-          <w:rFonts w:ascii="Arial" w:eastAsia="Arial" w:hAnsi="Arial" w:cs="Arial"/>
-          <w:sz w:val="16"/>
-        </w:rPr>
-        <w:t xml:space="preserve">Revisó: </w:t>
-      </w:r>
-      <w:r>
-        <w:rPr>
-          <w:rFonts w:ascii="Arial" w:eastAsia="Arial" w:hAnsi="Arial" w:cs="Arial"/>
-          <w:sz w:val="16"/>
-        </w:rPr>
-        <w:t>${NOMBRE_REVISO} – ${CARGO_REVISO}</w:t>
-      </w:r>
-      <w:bookmarkStart w:id="2" w:name="_GoBack"/>
-      <w:bookmarkEnd w:id="2"/>
     </w:p>
     <w:p>
       <w:pPr>
         <w:jc w:val="both"/>
         <w:rPr>
-          <w:rFonts w:ascii="Arial" w:hAnsi="Arial" w:cs="Arial"/>
+          <w:rFonts w:ascii="Arial" w:eastAsia="Arial" w:hAnsi="Arial" w:cs="Arial"/>
         </w:rPr>
       </w:pPr>
     </w:p>
     <w:sectPr>
-      <w:headerReference w:type="default" r:id="rId9"/>
-      <w:footerReference w:type="default" r:id="rId10"/>
+      <w:headerReference w:type="default" r:id="rId7"/>
+      <w:footerReference w:type="default" r:id="rId8"/>
       <w:pgSz w:w="12242" w:h="15842"/>
       <w:pgMar w:top="1418" w:right="1418" w:bottom="1418" w:left="1418" w:header="720" w:footer="1134" w:gutter="0"/>
+      <w:pgNumType w:start="1"/>
       <w:cols w:space="720"/>
     </w:sectPr>
   </w:body>
@@ -1067,10 +1049,21 @@
 <w:ftr xmlns:wpc="http://schemas.microsoft.com/office/word/2010/wordprocessingCanvas" xmlns:mc="http://schemas.openxmlformats.org/markup-compatibility/2006" xmlns:o="urn:schemas-microsoft-com:office:office" xmlns:r="http://schemas.openxmlformats.org/officeDocument/2006/relationships" xmlns:m="http://schemas.openxmlformats.org/officeDocument/2006/math" xmlns:v="urn:schemas-microsoft-com:vml" xmlns:wp14="http://schemas.microsoft.com/office/word/2010/wordprocessingDrawing" xmlns:wp="http://schemas.openxmlformats.org/drawingml/2006/wordprocessingDrawing" xmlns:w10="urn:schemas-microsoft-com:office:word" xmlns:w="http://schemas.openxmlformats.org/wordprocessingml/2006/main" xmlns:w14="http://schemas.microsoft.com/office/word/2010/wordml" xmlns:wpg="http://schemas.microsoft.com/office/word/2010/wordprocessingGroup" xmlns:wpi="http://schemas.microsoft.com/office/word/2010/wordprocessingInk" xmlns:wne="http://schemas.microsoft.com/office/word/2006/wordml" xmlns:wps="http://schemas.microsoft.com/office/word/2010/wordprocessingShape" mc:Ignorable="w14 wp14">
   <w:p>
     <w:pPr>
-      <w:pStyle w:val="Piedepgina"/>
+      <w:pBdr>
+        <w:top w:val="nil"/>
+        <w:left w:val="nil"/>
+        <w:bottom w:val="nil"/>
+        <w:right w:val="nil"/>
+        <w:between w:val="nil"/>
+      </w:pBdr>
+      <w:tabs>
+        <w:tab w:val="center" w:pos="4252"/>
+        <w:tab w:val="right" w:pos="8504"/>
+      </w:tabs>
       <w:jc w:val="both"/>
       <w:rPr>
-        <w:rFonts w:ascii="Arial" w:hAnsi="Arial" w:cs="Arial"/>
+        <w:rFonts w:ascii="Arial" w:eastAsia="Arial" w:hAnsi="Arial" w:cs="Arial"/>
+        <w:color w:val="000000"/>
         <w:sz w:val="16"/>
         <w:szCs w:val="16"/>
       </w:rPr>
@@ -1078,12 +1071,26 @@
   </w:p>
   <w:p>
     <w:pPr>
-      <w:pStyle w:val="Piedepgina"/>
+      <w:pBdr>
+        <w:top w:val="nil"/>
+        <w:left w:val="nil"/>
+        <w:bottom w:val="nil"/>
+        <w:right w:val="nil"/>
+        <w:between w:val="nil"/>
+      </w:pBdr>
+      <w:tabs>
+        <w:tab w:val="center" w:pos="4252"/>
+        <w:tab w:val="right" w:pos="8504"/>
+      </w:tabs>
       <w:jc w:val="both"/>
+      <w:rPr>
+        <w:color w:val="000000"/>
+      </w:rPr>
     </w:pPr>
     <w:r>
       <w:rPr>
-        <w:rFonts w:ascii="Arial" w:hAnsi="Arial" w:cs="Arial"/>
+        <w:rFonts w:ascii="Arial" w:eastAsia="Arial" w:hAnsi="Arial" w:cs="Arial"/>
+        <w:color w:val="000000"/>
         <w:sz w:val="16"/>
         <w:szCs w:val="16"/>
       </w:rPr>
@@ -1092,16 +1099,27 @@
   </w:p>
   <w:p>
     <w:pPr>
-      <w:pStyle w:val="Piedepgina"/>
+      <w:pBdr>
+        <w:top w:val="nil"/>
+        <w:left w:val="nil"/>
+        <w:bottom w:val="nil"/>
+        <w:right w:val="nil"/>
+        <w:between w:val="nil"/>
+      </w:pBdr>
       <w:tabs>
-        <w:tab w:val="clear" w:pos="8504"/>
+        <w:tab w:val="center" w:pos="4252"/>
+        <w:tab w:val="right" w:pos="8504"/>
         <w:tab w:val="right" w:pos="8505"/>
       </w:tabs>
       <w:jc w:val="right"/>
+      <w:rPr>
+        <w:color w:val="000000"/>
+      </w:rPr>
     </w:pPr>
     <w:r>
       <w:rPr>
-        <w:rFonts w:ascii="Arial" w:hAnsi="Arial" w:cs="Arial"/>
+        <w:rFonts w:ascii="Arial" w:eastAsia="Arial" w:hAnsi="Arial" w:cs="Arial"/>
+        <w:color w:val="000000"/>
         <w:sz w:val="16"/>
         <w:szCs w:val="16"/>
       </w:rPr>
@@ -1109,7 +1127,8 @@
     </w:r>
     <w:r>
       <w:rPr>
-        <w:rFonts w:ascii="Arial" w:hAnsi="Arial" w:cs="Arial"/>
+        <w:rFonts w:ascii="Arial" w:eastAsia="Arial" w:hAnsi="Arial" w:cs="Arial"/>
+        <w:color w:val="000000"/>
         <w:sz w:val="16"/>
         <w:szCs w:val="16"/>
       </w:rPr>
@@ -1117,15 +1136,17 @@
     </w:r>
     <w:r>
       <w:rPr>
-        <w:rFonts w:ascii="Arial" w:hAnsi="Arial" w:cs="Arial"/>
+        <w:rFonts w:ascii="Arial" w:eastAsia="Arial" w:hAnsi="Arial" w:cs="Arial"/>
+        <w:color w:val="000000"/>
         <w:sz w:val="16"/>
         <w:szCs w:val="16"/>
       </w:rPr>
-      <w:instrText xml:space="preserve"> PAGE </w:instrText>
+      <w:instrText>PAGE</w:instrText>
     </w:r>
     <w:r>
       <w:rPr>
-        <w:rFonts w:ascii="Arial" w:hAnsi="Arial" w:cs="Arial"/>
+        <w:rFonts w:ascii="Arial" w:eastAsia="Arial" w:hAnsi="Arial" w:cs="Arial"/>
+        <w:color w:val="000000"/>
         <w:sz w:val="16"/>
         <w:szCs w:val="16"/>
       </w:rPr>
@@ -1133,16 +1154,18 @@
     </w:r>
     <w:r>
       <w:rPr>
-        <w:rFonts w:ascii="Arial" w:hAnsi="Arial" w:cs="Arial"/>
+        <w:rFonts w:ascii="Arial" w:eastAsia="Arial" w:hAnsi="Arial" w:cs="Arial"/>
         <w:noProof/>
+        <w:color w:val="000000"/>
         <w:sz w:val="16"/>
         <w:szCs w:val="16"/>
       </w:rPr>
-      <w:t>2</w:t>
+      <w:t>1</w:t>
     </w:r>
     <w:r>
       <w:rPr>
-        <w:rFonts w:ascii="Arial" w:hAnsi="Arial" w:cs="Arial"/>
+        <w:rFonts w:ascii="Arial" w:eastAsia="Arial" w:hAnsi="Arial" w:cs="Arial"/>
+        <w:color w:val="000000"/>
         <w:sz w:val="16"/>
         <w:szCs w:val="16"/>
       </w:rPr>
@@ -1150,19 +1173,12 @@
     </w:r>
     <w:r>
       <w:rPr>
-        <w:rFonts w:ascii="Arial" w:hAnsi="Arial" w:cs="Arial"/>
+        <w:rFonts w:ascii="Arial" w:eastAsia="Arial" w:hAnsi="Arial" w:cs="Arial"/>
+        <w:color w:val="000000"/>
         <w:sz w:val="16"/>
         <w:szCs w:val="16"/>
       </w:rPr>
-      <w:t xml:space="preserve"> de </w:t>
-    </w:r>
-    <w:r>
-      <w:rPr>
-        <w:rFonts w:ascii="Arial" w:hAnsi="Arial" w:cs="Arial"/>
-        <w:sz w:val="16"/>
-        <w:szCs w:val="16"/>
-      </w:rPr>
-      <w:t>2</w:t>
+      <w:t xml:space="preserve"> de 2</w:t>
     </w:r>
   </w:p>
 </w:ftr>
@@ -1173,9 +1189,6 @@
   <w:footnote w:type="separator" w:id="-1">
     <w:p>
       <w:r>
-        <w:rPr>
-          <w:color w:val="000000"/>
-        </w:rPr>
         <w:separator/>
       </w:r>
     </w:p>
@@ -1192,15 +1205,28 @@
 
 <file path=word/header1.xml><?xml version="1.0" encoding="utf-8"?>
 <w:hdr xmlns:wpc="http://schemas.microsoft.com/office/word/2010/wordprocessingCanvas" xmlns:mc="http://schemas.openxmlformats.org/markup-compatibility/2006" xmlns:o="urn:schemas-microsoft-com:office:office" xmlns:r="http://schemas.openxmlformats.org/officeDocument/2006/relationships" xmlns:m="http://schemas.openxmlformats.org/officeDocument/2006/math" xmlns:v="urn:schemas-microsoft-com:vml" xmlns:wp14="http://schemas.microsoft.com/office/word/2010/wordprocessingDrawing" xmlns:wp="http://schemas.openxmlformats.org/drawingml/2006/wordprocessingDrawing" xmlns:w10="urn:schemas-microsoft-com:office:word" xmlns:w="http://schemas.openxmlformats.org/wordprocessingml/2006/main" xmlns:w14="http://schemas.microsoft.com/office/word/2010/wordml" xmlns:wpg="http://schemas.microsoft.com/office/word/2010/wordprocessingGroup" xmlns:wpi="http://schemas.microsoft.com/office/word/2010/wordprocessingInk" xmlns:wne="http://schemas.microsoft.com/office/word/2006/wordml" xmlns:wps="http://schemas.microsoft.com/office/word/2010/wordprocessingShape" mc:Ignorable="w14 wp14">
+  <w:p>
+    <w:pPr>
+      <w:widowControl w:val="0"/>
+      <w:pBdr>
+        <w:top w:val="nil"/>
+        <w:left w:val="nil"/>
+        <w:bottom w:val="nil"/>
+        <w:right w:val="nil"/>
+        <w:between w:val="nil"/>
+      </w:pBdr>
+      <w:spacing w:line="276" w:lineRule="auto"/>
+      <w:rPr>
+        <w:rFonts w:ascii="Arial" w:eastAsia="Arial" w:hAnsi="Arial" w:cs="Arial"/>
+      </w:rPr>
+    </w:pPr>
+  </w:p>
   <w:tbl>
     <w:tblPr>
+      <w:tblStyle w:val="a2"/>
       <w:tblW w:w="9639" w:type="dxa"/>
-      <w:tblInd w:w="-5" w:type="dxa"/>
+      <w:tblInd w:w="-113" w:type="dxa"/>
       <w:tblLayout w:type="fixed"/>
-      <w:tblCellMar>
-        <w:left w:w="10" w:type="dxa"/>
-        <w:right w:w="10" w:type="dxa"/>
-      </w:tblCellMar>
       <w:tblLook w:val="0000" w:firstRow="0" w:lastRow="0" w:firstColumn="0" w:lastColumn="0" w:noHBand="0" w:noVBand="0"/>
     </w:tblPr>
     <w:tblGrid>
@@ -1234,29 +1260,43 @@
         </w:tcPr>
         <w:p>
           <w:pPr>
-            <w:pStyle w:val="Encabezado"/>
+            <w:pBdr>
+              <w:top w:val="nil"/>
+              <w:left w:val="nil"/>
+              <w:bottom w:val="nil"/>
+              <w:right w:val="nil"/>
+              <w:between w:val="nil"/>
+            </w:pBdr>
+            <w:tabs>
+              <w:tab w:val="center" w:pos="4252"/>
+              <w:tab w:val="right" w:pos="8504"/>
+            </w:tabs>
             <w:jc w:val="center"/>
+            <w:rPr>
+              <w:color w:val="000000"/>
+            </w:rPr>
           </w:pPr>
           <w:r>
             <w:rPr>
-              <w:rFonts w:ascii="Arial" w:hAnsi="Arial" w:cs="Arial"/>
+              <w:rFonts w:ascii="Arial" w:eastAsia="Arial" w:hAnsi="Arial" w:cs="Arial"/>
               <w:noProof/>
+              <w:color w:val="000000"/>
               <w:sz w:val="14"/>
               <w:szCs w:val="14"/>
-              <w:lang w:val="es-CO" w:eastAsia="es-CO"/>
+              <w:lang w:val="es-CO"/>
             </w:rPr>
             <w:drawing>
-              <wp:inline distT="0" distB="0" distL="0" distR="0" wp14:anchorId="5C09EE11" wp14:editId="03FEFAE4">
+              <wp:inline distT="0" distB="0" distL="0" distR="0">
                 <wp:extent cx="1079997" cy="828675"/>
-                <wp:effectExtent l="0" t="0" r="5853" b="9525"/>
-                <wp:docPr id="1" name="Imagen 1" descr="escudo"/>
+                <wp:effectExtent l="0" t="0" r="0" b="0"/>
+                <wp:docPr id="1" name="image1.jpg" descr="escudo"/>
                 <wp:cNvGraphicFramePr/>
                 <a:graphic xmlns:a="http://schemas.openxmlformats.org/drawingml/2006/main">
                   <a:graphicData uri="http://schemas.openxmlformats.org/drawingml/2006/picture">
                     <pic:pic xmlns:pic="http://schemas.openxmlformats.org/drawingml/2006/picture">
                       <pic:nvPicPr>
-                        <pic:cNvPr id="0" name=""/>
-                        <pic:cNvPicPr/>
+                        <pic:cNvPr id="0" name="image1.jpg" descr="escudo"/>
+                        <pic:cNvPicPr preferRelativeResize="0"/>
                       </pic:nvPicPr>
                       <pic:blipFill>
                         <a:blip r:embed="rId1"/>
@@ -1273,11 +1313,7 @@
                         <a:prstGeom prst="rect">
                           <a:avLst/>
                         </a:prstGeom>
-                        <a:noFill/>
-                        <a:ln>
-                          <a:noFill/>
-                          <a:prstDash/>
-                        </a:ln>
+                        <a:ln/>
                       </pic:spPr>
                     </pic:pic>
                   </a:graphicData>
@@ -1288,51 +1324,94 @@
         </w:p>
         <w:p>
           <w:pPr>
-            <w:pStyle w:val="Encabezado"/>
+            <w:pBdr>
+              <w:top w:val="nil"/>
+              <w:left w:val="nil"/>
+              <w:bottom w:val="nil"/>
+              <w:right w:val="nil"/>
+              <w:between w:val="nil"/>
+            </w:pBdr>
+            <w:tabs>
+              <w:tab w:val="center" w:pos="4252"/>
+              <w:tab w:val="right" w:pos="8504"/>
+            </w:tabs>
             <w:jc w:val="center"/>
             <w:rPr>
+              <w:color w:val="000000"/>
               <w:sz w:val="14"/>
               <w:szCs w:val="14"/>
-              <w:lang w:val="es-CO" w:eastAsia="es-CO"/>
             </w:rPr>
           </w:pPr>
         </w:p>
         <w:p>
           <w:pPr>
-            <w:pStyle w:val="Encabezado"/>
+            <w:pBdr>
+              <w:top w:val="nil"/>
+              <w:left w:val="nil"/>
+              <w:bottom w:val="nil"/>
+              <w:right w:val="nil"/>
+              <w:between w:val="nil"/>
+            </w:pBdr>
+            <w:tabs>
+              <w:tab w:val="center" w:pos="4252"/>
+              <w:tab w:val="right" w:pos="8504"/>
+            </w:tabs>
             <w:jc w:val="center"/>
             <w:rPr>
-              <w:rFonts w:ascii="Arial" w:hAnsi="Arial" w:cs="Arial"/>
-              <w:lang w:val="es-CO" w:eastAsia="es-CO"/>
+              <w:rFonts w:ascii="Arial" w:eastAsia="Arial" w:hAnsi="Arial" w:cs="Arial"/>
+              <w:color w:val="000000"/>
             </w:rPr>
           </w:pPr>
           <w:r>
             <w:rPr>
-              <w:rFonts w:ascii="Arial" w:hAnsi="Arial" w:cs="Arial"/>
-              <w:lang w:val="es-CO" w:eastAsia="es-CO"/>
+              <w:rFonts w:ascii="Arial" w:eastAsia="Arial" w:hAnsi="Arial" w:cs="Arial"/>
+              <w:color w:val="000000"/>
             </w:rPr>
             <w:t>GESTIÓN JURÍDICO ADMINISTRATIVA</w:t>
           </w:r>
         </w:p>
         <w:p>
           <w:pPr>
-            <w:pStyle w:val="Encabezado"/>
+            <w:pBdr>
+              <w:top w:val="nil"/>
+              <w:left w:val="nil"/>
+              <w:bottom w:val="nil"/>
+              <w:right w:val="nil"/>
+              <w:between w:val="nil"/>
+            </w:pBdr>
+            <w:tabs>
+              <w:tab w:val="center" w:pos="4252"/>
+              <w:tab w:val="right" w:pos="8504"/>
+            </w:tabs>
             <w:jc w:val="center"/>
             <w:rPr>
-              <w:rFonts w:ascii="Arial" w:hAnsi="Arial" w:cs="Arial"/>
-              <w:lang w:val="es-CO" w:eastAsia="es-CO"/>
+              <w:rFonts w:ascii="Arial" w:eastAsia="Arial" w:hAnsi="Arial" w:cs="Arial"/>
+              <w:color w:val="000000"/>
             </w:rPr>
           </w:pPr>
         </w:p>
         <w:p>
           <w:pPr>
-            <w:pStyle w:val="Encabezado"/>
+            <w:pBdr>
+              <w:top w:val="nil"/>
+              <w:left w:val="nil"/>
+              <w:bottom w:val="nil"/>
+              <w:right w:val="nil"/>
+              <w:between w:val="nil"/>
+            </w:pBdr>
+            <w:tabs>
+              <w:tab w:val="center" w:pos="4252"/>
+              <w:tab w:val="right" w:pos="8504"/>
+            </w:tabs>
             <w:jc w:val="center"/>
+            <w:rPr>
+              <w:color w:val="000000"/>
+            </w:rPr>
           </w:pPr>
           <w:r>
             <w:rPr>
-              <w:rFonts w:ascii="Arial" w:hAnsi="Arial" w:cs="Arial"/>
-              <w:lang w:val="es-CO" w:eastAsia="es-CO"/>
+              <w:rFonts w:ascii="Arial" w:eastAsia="Arial" w:hAnsi="Arial" w:cs="Arial"/>
+              <w:color w:val="000000"/>
             </w:rPr>
             <w:t>GESTIÓN CONTRACTUAL</w:t>
           </w:r>
@@ -1358,89 +1437,170 @@
         </w:tcPr>
         <w:p>
           <w:pPr>
-            <w:pStyle w:val="Encabezado"/>
+            <w:pBdr>
+              <w:top w:val="nil"/>
+              <w:left w:val="nil"/>
+              <w:bottom w:val="nil"/>
+              <w:right w:val="nil"/>
+              <w:between w:val="nil"/>
+            </w:pBdr>
+            <w:tabs>
+              <w:tab w:val="center" w:pos="4252"/>
+              <w:tab w:val="right" w:pos="8504"/>
+            </w:tabs>
             <w:jc w:val="center"/>
             <w:rPr>
-              <w:rFonts w:ascii="Arial" w:hAnsi="Arial" w:cs="Arial"/>
+              <w:rFonts w:ascii="Arial" w:eastAsia="Arial" w:hAnsi="Arial" w:cs="Arial"/>
+              <w:color w:val="000000"/>
             </w:rPr>
           </w:pPr>
         </w:p>
         <w:p>
           <w:pPr>
-            <w:pStyle w:val="Encabezado"/>
+            <w:pBdr>
+              <w:top w:val="nil"/>
+              <w:left w:val="nil"/>
+              <w:bottom w:val="nil"/>
+              <w:right w:val="nil"/>
+              <w:between w:val="nil"/>
+            </w:pBdr>
+            <w:tabs>
+              <w:tab w:val="center" w:pos="4252"/>
+              <w:tab w:val="right" w:pos="8504"/>
+            </w:tabs>
             <w:jc w:val="center"/>
             <w:rPr>
-              <w:rFonts w:ascii="Arial" w:hAnsi="Arial" w:cs="Arial"/>
+              <w:rFonts w:ascii="Arial" w:eastAsia="Arial" w:hAnsi="Arial" w:cs="Arial"/>
+              <w:color w:val="000000"/>
             </w:rPr>
           </w:pPr>
           <w:r>
             <w:rPr>
-              <w:rFonts w:ascii="Arial" w:hAnsi="Arial" w:cs="Arial"/>
+              <w:rFonts w:ascii="Arial" w:eastAsia="Arial" w:hAnsi="Arial" w:cs="Arial"/>
+              <w:color w:val="000000"/>
             </w:rPr>
             <w:t>MODELO INTEGRADO DE</w:t>
           </w:r>
         </w:p>
         <w:p>
           <w:pPr>
-            <w:pStyle w:val="Encabezado"/>
+            <w:pBdr>
+              <w:top w:val="nil"/>
+              <w:left w:val="nil"/>
+              <w:bottom w:val="nil"/>
+              <w:right w:val="nil"/>
+              <w:between w:val="nil"/>
+            </w:pBdr>
+            <w:tabs>
+              <w:tab w:val="center" w:pos="4252"/>
+              <w:tab w:val="right" w:pos="8504"/>
+            </w:tabs>
             <w:jc w:val="center"/>
             <w:rPr>
-              <w:rFonts w:ascii="Arial" w:hAnsi="Arial" w:cs="Arial"/>
+              <w:rFonts w:ascii="Arial" w:eastAsia="Arial" w:hAnsi="Arial" w:cs="Arial"/>
+              <w:color w:val="000000"/>
             </w:rPr>
           </w:pPr>
           <w:r>
             <w:rPr>
-              <w:rFonts w:ascii="Arial" w:hAnsi="Arial" w:cs="Arial"/>
+              <w:rFonts w:ascii="Arial" w:eastAsia="Arial" w:hAnsi="Arial" w:cs="Arial"/>
+              <w:color w:val="000000"/>
             </w:rPr>
             <w:t xml:space="preserve"> PLANEACIÓN Y GESTIÓN</w:t>
           </w:r>
         </w:p>
         <w:p>
           <w:pPr>
-            <w:pStyle w:val="Encabezado"/>
+            <w:pBdr>
+              <w:top w:val="nil"/>
+              <w:left w:val="nil"/>
+              <w:bottom w:val="nil"/>
+              <w:right w:val="nil"/>
+              <w:between w:val="nil"/>
+            </w:pBdr>
+            <w:tabs>
+              <w:tab w:val="center" w:pos="4252"/>
+              <w:tab w:val="right" w:pos="8504"/>
+            </w:tabs>
             <w:jc w:val="center"/>
             <w:rPr>
-              <w:rFonts w:ascii="Arial" w:hAnsi="Arial" w:cs="Arial"/>
+              <w:rFonts w:ascii="Arial" w:eastAsia="Arial" w:hAnsi="Arial" w:cs="Arial"/>
+              <w:color w:val="000000"/>
             </w:rPr>
           </w:pPr>
         </w:p>
         <w:p>
           <w:pPr>
-            <w:pStyle w:val="Encabezado"/>
+            <w:pBdr>
+              <w:top w:val="nil"/>
+              <w:left w:val="nil"/>
+              <w:bottom w:val="nil"/>
+              <w:right w:val="nil"/>
+              <w:between w:val="nil"/>
+            </w:pBdr>
+            <w:tabs>
+              <w:tab w:val="center" w:pos="4252"/>
+              <w:tab w:val="right" w:pos="8504"/>
+            </w:tabs>
             <w:jc w:val="center"/>
             <w:rPr>
-              <w:rFonts w:ascii="Arial" w:hAnsi="Arial" w:cs="Arial"/>
+              <w:rFonts w:ascii="Arial" w:eastAsia="Arial" w:hAnsi="Arial" w:cs="Arial"/>
+              <w:color w:val="000000"/>
             </w:rPr>
           </w:pPr>
           <w:r>
             <w:rPr>
-              <w:rFonts w:ascii="Arial" w:hAnsi="Arial" w:cs="Arial"/>
+              <w:rFonts w:ascii="Arial" w:eastAsia="Arial" w:hAnsi="Arial" w:cs="Arial"/>
+              <w:color w:val="000000"/>
             </w:rPr>
             <w:t>(MIPG)</w:t>
           </w:r>
         </w:p>
         <w:p>
           <w:pPr>
-            <w:pStyle w:val="Encabezado"/>
+            <w:pBdr>
+              <w:top w:val="nil"/>
+              <w:left w:val="nil"/>
+              <w:bottom w:val="nil"/>
+              <w:right w:val="nil"/>
+              <w:between w:val="nil"/>
+            </w:pBdr>
+            <w:tabs>
+              <w:tab w:val="center" w:pos="4252"/>
+              <w:tab w:val="right" w:pos="8504"/>
+            </w:tabs>
             <w:jc w:val="center"/>
             <w:rPr>
-              <w:rFonts w:ascii="Arial" w:hAnsi="Arial" w:cs="Arial"/>
+              <w:rFonts w:ascii="Arial" w:eastAsia="Arial" w:hAnsi="Arial" w:cs="Arial"/>
+              <w:color w:val="000000"/>
             </w:rPr>
           </w:pPr>
         </w:p>
         <w:p>
           <w:pPr>
-            <w:pStyle w:val="Encabezado"/>
+            <w:pBdr>
+              <w:top w:val="nil"/>
+              <w:left w:val="nil"/>
+              <w:bottom w:val="nil"/>
+              <w:right w:val="nil"/>
+              <w:between w:val="nil"/>
+            </w:pBdr>
+            <w:tabs>
+              <w:tab w:val="center" w:pos="4252"/>
+              <w:tab w:val="right" w:pos="8504"/>
+            </w:tabs>
             <w:jc w:val="center"/>
             <w:rPr>
-              <w:rFonts w:ascii="Arial" w:hAnsi="Arial" w:cs="Arial"/>
+              <w:rFonts w:ascii="Arial" w:eastAsia="Arial" w:hAnsi="Arial" w:cs="Arial"/>
+              <w:color w:val="000000"/>
               <w:sz w:val="24"/>
               <w:szCs w:val="24"/>
             </w:rPr>
           </w:pPr>
           <w:r>
             <w:rPr>
-              <w:rFonts w:ascii="Arial" w:hAnsi="Arial" w:cs="Arial"/>
+              <w:rFonts w:ascii="Arial" w:eastAsia="Arial" w:hAnsi="Arial" w:cs="Arial"/>
+              <w:color w:val="000000"/>
               <w:sz w:val="24"/>
               <w:szCs w:val="24"/>
             </w:rPr>
@@ -1468,19 +1628,18 @@
         </w:tcPr>
         <w:p>
           <w:pPr>
-            <w:autoSpaceDE w:val="0"/>
             <w:jc w:val="center"/>
             <w:rPr>
-              <w:rFonts w:ascii="Arial" w:hAnsi="Arial" w:cs="Arial"/>
+              <w:rFonts w:ascii="Arial" w:eastAsia="Arial" w:hAnsi="Arial" w:cs="Arial"/>
               <w:sz w:val="18"/>
               <w:szCs w:val="18"/>
             </w:rPr>
           </w:pPr>
           <w:r>
             <w:rPr>
-              <w:rFonts w:ascii="Arial" w:hAnsi="Arial" w:cs="Arial"/>
+              <w:rFonts w:ascii="Arial" w:eastAsia="Arial" w:hAnsi="Arial" w:cs="Arial"/>
               <w:color w:val="000000"/>
-              <w:shd w:val="clear" w:color="auto" w:fill="FFFFFF"/>
+              <w:highlight w:val="white"/>
             </w:rPr>
             <w:t>MAJA01.04.01.P001.F002</w:t>
           </w:r>
@@ -1512,7 +1671,20 @@
         </w:tcPr>
         <w:p>
           <w:pPr>
-            <w:pStyle w:val="Encabezado"/>
+            <w:widowControl w:val="0"/>
+            <w:pBdr>
+              <w:top w:val="nil"/>
+              <w:left w:val="nil"/>
+              <w:bottom w:val="nil"/>
+              <w:right w:val="nil"/>
+              <w:between w:val="nil"/>
+            </w:pBdr>
+            <w:spacing w:line="276" w:lineRule="auto"/>
+            <w:rPr>
+              <w:rFonts w:ascii="Arial" w:eastAsia="Arial" w:hAnsi="Arial" w:cs="Arial"/>
+              <w:sz w:val="18"/>
+              <w:szCs w:val="18"/>
+            </w:rPr>
           </w:pPr>
         </w:p>
       </w:tc>
@@ -1536,7 +1708,20 @@
         </w:tcPr>
         <w:p>
           <w:pPr>
-            <w:pStyle w:val="Encabezado"/>
+            <w:widowControl w:val="0"/>
+            <w:pBdr>
+              <w:top w:val="nil"/>
+              <w:left w:val="nil"/>
+              <w:bottom w:val="nil"/>
+              <w:right w:val="nil"/>
+              <w:between w:val="nil"/>
+            </w:pBdr>
+            <w:spacing w:line="276" w:lineRule="auto"/>
+            <w:rPr>
+              <w:rFonts w:ascii="Arial" w:eastAsia="Arial" w:hAnsi="Arial" w:cs="Arial"/>
+              <w:sz w:val="18"/>
+              <w:szCs w:val="18"/>
+            </w:rPr>
           </w:pPr>
         </w:p>
       </w:tc>
@@ -1559,17 +1744,29 @@
         </w:tcPr>
         <w:p>
           <w:pPr>
-            <w:pStyle w:val="Encabezado"/>
+            <w:pBdr>
+              <w:top w:val="nil"/>
+              <w:left w:val="nil"/>
+              <w:bottom w:val="nil"/>
+              <w:right w:val="nil"/>
+              <w:between w:val="nil"/>
+            </w:pBdr>
+            <w:tabs>
+              <w:tab w:val="center" w:pos="4252"/>
+              <w:tab w:val="right" w:pos="8504"/>
+            </w:tabs>
             <w:jc w:val="center"/>
             <w:rPr>
-              <w:rFonts w:ascii="Arial" w:hAnsi="Arial" w:cs="Arial"/>
+              <w:rFonts w:ascii="Arial" w:eastAsia="Arial" w:hAnsi="Arial" w:cs="Arial"/>
+              <w:color w:val="000000"/>
               <w:sz w:val="16"/>
               <w:szCs w:val="16"/>
             </w:rPr>
           </w:pPr>
           <w:r>
             <w:rPr>
-              <w:rFonts w:ascii="Arial" w:hAnsi="Arial" w:cs="Arial"/>
+              <w:rFonts w:ascii="Arial" w:eastAsia="Arial" w:hAnsi="Arial" w:cs="Arial"/>
+              <w:color w:val="000000"/>
               <w:sz w:val="16"/>
               <w:szCs w:val="16"/>
             </w:rPr>
@@ -1596,12 +1793,26 @@
         </w:tcPr>
         <w:p>
           <w:pPr>
-            <w:pStyle w:val="Encabezado"/>
+            <w:pBdr>
+              <w:top w:val="nil"/>
+              <w:left w:val="nil"/>
+              <w:bottom w:val="nil"/>
+              <w:right w:val="nil"/>
+              <w:between w:val="nil"/>
+            </w:pBdr>
+            <w:tabs>
+              <w:tab w:val="center" w:pos="4252"/>
+              <w:tab w:val="right" w:pos="8504"/>
+            </w:tabs>
             <w:jc w:val="center"/>
+            <w:rPr>
+              <w:color w:val="000000"/>
+            </w:rPr>
           </w:pPr>
           <w:r>
             <w:rPr>
-              <w:rFonts w:ascii="Arial" w:hAnsi="Arial" w:cs="Arial"/>
+              <w:rFonts w:ascii="Arial" w:eastAsia="Arial" w:hAnsi="Arial" w:cs="Arial"/>
+              <w:color w:val="000000"/>
               <w:sz w:val="16"/>
               <w:szCs w:val="16"/>
             </w:rPr>
@@ -1613,430 +1824,23 @@
   </w:tbl>
   <w:p>
     <w:pPr>
-      <w:pStyle w:val="Encabezado"/>
+      <w:pBdr>
+        <w:top w:val="nil"/>
+        <w:left w:val="nil"/>
+        <w:bottom w:val="nil"/>
+        <w:right w:val="nil"/>
+        <w:between w:val="nil"/>
+      </w:pBdr>
+      <w:tabs>
+        <w:tab w:val="center" w:pos="4252"/>
+        <w:tab w:val="right" w:pos="8504"/>
+      </w:tabs>
+      <w:rPr>
+        <w:color w:val="000000"/>
+      </w:rPr>
     </w:pPr>
   </w:p>
 </w:hdr>
-</file>
-
-<file path=word/numbering.xml><?xml version="1.0" encoding="utf-8"?>
-<w:numbering xmlns:wpc="http://schemas.microsoft.com/office/word/2010/wordprocessingCanvas" xmlns:mc="http://schemas.openxmlformats.org/markup-compatibility/2006" xmlns:o="urn:schemas-microsoft-com:office:office" xmlns:r="http://schemas.openxmlformats.org/officeDocument/2006/relationships" xmlns:m="http://schemas.openxmlformats.org/officeDocument/2006/math" xmlns:v="urn:schemas-microsoft-com:vml" xmlns:wp14="http://schemas.microsoft.com/office/word/2010/wordprocessingDrawing" xmlns:wp="http://schemas.openxmlformats.org/drawingml/2006/wordprocessingDrawing" xmlns:w10="urn:schemas-microsoft-com:office:word" xmlns:w="http://schemas.openxmlformats.org/wordprocessingml/2006/main" xmlns:w14="http://schemas.microsoft.com/office/word/2010/wordml" xmlns:wpg="http://schemas.microsoft.com/office/word/2010/wordprocessingGroup" xmlns:wpi="http://schemas.microsoft.com/office/word/2010/wordprocessingInk" xmlns:wne="http://schemas.microsoft.com/office/word/2006/wordml" xmlns:wps="http://schemas.microsoft.com/office/word/2010/wordprocessingShape" mc:Ignorable="w14 wp14">
-  <w:abstractNum w:abstractNumId="0">
-    <w:nsid w:val="004745FA"/>
-    <w:multiLevelType w:val="hybridMultilevel"/>
-    <w:tmpl w:val="15641AE0"/>
-    <w:lvl w:ilvl="0" w:tplc="240A0001">
-      <w:start w:val="1"/>
-      <w:numFmt w:val="bullet"/>
-      <w:lvlText w:val=""/>
-      <w:lvlJc w:val="left"/>
-      <w:pPr>
-        <w:ind w:left="360" w:hanging="360"/>
-      </w:pPr>
-      <w:rPr>
-        <w:rFonts w:ascii="Symbol" w:hAnsi="Symbol" w:hint="default"/>
-      </w:rPr>
-    </w:lvl>
-    <w:lvl w:ilvl="1" w:tplc="240A0003" w:tentative="1">
-      <w:start w:val="1"/>
-      <w:numFmt w:val="bullet"/>
-      <w:lvlText w:val="o"/>
-      <w:lvlJc w:val="left"/>
-      <w:pPr>
-        <w:ind w:left="1080" w:hanging="360"/>
-      </w:pPr>
-      <w:rPr>
-        <w:rFonts w:ascii="Courier New" w:hAnsi="Courier New" w:cs="Courier New" w:hint="default"/>
-      </w:rPr>
-    </w:lvl>
-    <w:lvl w:ilvl="2" w:tplc="240A0005" w:tentative="1">
-      <w:start w:val="1"/>
-      <w:numFmt w:val="bullet"/>
-      <w:lvlText w:val=""/>
-      <w:lvlJc w:val="left"/>
-      <w:pPr>
-        <w:ind w:left="1800" w:hanging="360"/>
-      </w:pPr>
-      <w:rPr>
-        <w:rFonts w:ascii="Wingdings" w:hAnsi="Wingdings" w:hint="default"/>
-      </w:rPr>
-    </w:lvl>
-    <w:lvl w:ilvl="3" w:tplc="240A0001" w:tentative="1">
-      <w:start w:val="1"/>
-      <w:numFmt w:val="bullet"/>
-      <w:lvlText w:val=""/>
-      <w:lvlJc w:val="left"/>
-      <w:pPr>
-        <w:ind w:left="2520" w:hanging="360"/>
-      </w:pPr>
-      <w:rPr>
-        <w:rFonts w:ascii="Symbol" w:hAnsi="Symbol" w:hint="default"/>
-      </w:rPr>
-    </w:lvl>
-    <w:lvl w:ilvl="4" w:tplc="240A0003" w:tentative="1">
-      <w:start w:val="1"/>
-      <w:numFmt w:val="bullet"/>
-      <w:lvlText w:val="o"/>
-      <w:lvlJc w:val="left"/>
-      <w:pPr>
-        <w:ind w:left="3240" w:hanging="360"/>
-      </w:pPr>
-      <w:rPr>
-        <w:rFonts w:ascii="Courier New" w:hAnsi="Courier New" w:cs="Courier New" w:hint="default"/>
-      </w:rPr>
-    </w:lvl>
-    <w:lvl w:ilvl="5" w:tplc="240A0005" w:tentative="1">
-      <w:start w:val="1"/>
-      <w:numFmt w:val="bullet"/>
-      <w:lvlText w:val=""/>
-      <w:lvlJc w:val="left"/>
-      <w:pPr>
-        <w:ind w:left="3960" w:hanging="360"/>
-      </w:pPr>
-      <w:rPr>
-        <w:rFonts w:ascii="Wingdings" w:hAnsi="Wingdings" w:hint="default"/>
-      </w:rPr>
-    </w:lvl>
-    <w:lvl w:ilvl="6" w:tplc="240A0001" w:tentative="1">
-      <w:start w:val="1"/>
-      <w:numFmt w:val="bullet"/>
-      <w:lvlText w:val=""/>
-      <w:lvlJc w:val="left"/>
-      <w:pPr>
-        <w:ind w:left="4680" w:hanging="360"/>
-      </w:pPr>
-      <w:rPr>
-        <w:rFonts w:ascii="Symbol" w:hAnsi="Symbol" w:hint="default"/>
-      </w:rPr>
-    </w:lvl>
-    <w:lvl w:ilvl="7" w:tplc="240A0003" w:tentative="1">
-      <w:start w:val="1"/>
-      <w:numFmt w:val="bullet"/>
-      <w:lvlText w:val="o"/>
-      <w:lvlJc w:val="left"/>
-      <w:pPr>
-        <w:ind w:left="5400" w:hanging="360"/>
-      </w:pPr>
-      <w:rPr>
-        <w:rFonts w:ascii="Courier New" w:hAnsi="Courier New" w:cs="Courier New" w:hint="default"/>
-      </w:rPr>
-    </w:lvl>
-    <w:lvl w:ilvl="8" w:tplc="240A0005" w:tentative="1">
-      <w:start w:val="1"/>
-      <w:numFmt w:val="bullet"/>
-      <w:lvlText w:val=""/>
-      <w:lvlJc w:val="left"/>
-      <w:pPr>
-        <w:ind w:left="6120" w:hanging="360"/>
-      </w:pPr>
-      <w:rPr>
-        <w:rFonts w:ascii="Wingdings" w:hAnsi="Wingdings" w:hint="default"/>
-      </w:rPr>
-    </w:lvl>
-  </w:abstractNum>
-  <w:abstractNum w:abstractNumId="1">
-    <w:nsid w:val="152A1B7C"/>
-    <w:multiLevelType w:val="hybridMultilevel"/>
-    <w:tmpl w:val="8E665144"/>
-    <w:lvl w:ilvl="0" w:tplc="EB64E722">
-      <w:numFmt w:val="bullet"/>
-      <w:lvlText w:val="-"/>
-      <w:lvlJc w:val="left"/>
-      <w:pPr>
-        <w:ind w:left="720" w:hanging="360"/>
-      </w:pPr>
-      <w:rPr>
-        <w:rFonts w:ascii="Arial" w:eastAsia="Times New Roman" w:hAnsi="Arial" w:cs="Arial" w:hint="default"/>
-      </w:rPr>
-    </w:lvl>
-    <w:lvl w:ilvl="1" w:tplc="080A0003" w:tentative="1">
-      <w:start w:val="1"/>
-      <w:numFmt w:val="bullet"/>
-      <w:lvlText w:val="o"/>
-      <w:lvlJc w:val="left"/>
-      <w:pPr>
-        <w:ind w:left="1440" w:hanging="360"/>
-      </w:pPr>
-      <w:rPr>
-        <w:rFonts w:ascii="Courier New" w:hAnsi="Courier New" w:cs="Courier New" w:hint="default"/>
-      </w:rPr>
-    </w:lvl>
-    <w:lvl w:ilvl="2" w:tplc="080A0005" w:tentative="1">
-      <w:start w:val="1"/>
-      <w:numFmt w:val="bullet"/>
-      <w:lvlText w:val=""/>
-      <w:lvlJc w:val="left"/>
-      <w:pPr>
-        <w:ind w:left="2160" w:hanging="360"/>
-      </w:pPr>
-      <w:rPr>
-        <w:rFonts w:ascii="Wingdings" w:hAnsi="Wingdings" w:hint="default"/>
-      </w:rPr>
-    </w:lvl>
-    <w:lvl w:ilvl="3" w:tplc="080A0001" w:tentative="1">
-      <w:start w:val="1"/>
-      <w:numFmt w:val="bullet"/>
-      <w:lvlText w:val=""/>
-      <w:lvlJc w:val="left"/>
-      <w:pPr>
-        <w:ind w:left="2880" w:hanging="360"/>
-      </w:pPr>
-      <w:rPr>
-        <w:rFonts w:ascii="Symbol" w:hAnsi="Symbol" w:hint="default"/>
-      </w:rPr>
-    </w:lvl>
-    <w:lvl w:ilvl="4" w:tplc="080A0003" w:tentative="1">
-      <w:start w:val="1"/>
-      <w:numFmt w:val="bullet"/>
-      <w:lvlText w:val="o"/>
-      <w:lvlJc w:val="left"/>
-      <w:pPr>
-        <w:ind w:left="3600" w:hanging="360"/>
-      </w:pPr>
-      <w:rPr>
-        <w:rFonts w:ascii="Courier New" w:hAnsi="Courier New" w:cs="Courier New" w:hint="default"/>
-      </w:rPr>
-    </w:lvl>
-    <w:lvl w:ilvl="5" w:tplc="080A0005" w:tentative="1">
-      <w:start w:val="1"/>
-      <w:numFmt w:val="bullet"/>
-      <w:lvlText w:val=""/>
-      <w:lvlJc w:val="left"/>
-      <w:pPr>
-        <w:ind w:left="4320" w:hanging="360"/>
-      </w:pPr>
-      <w:rPr>
-        <w:rFonts w:ascii="Wingdings" w:hAnsi="Wingdings" w:hint="default"/>
-      </w:rPr>
-    </w:lvl>
-    <w:lvl w:ilvl="6" w:tplc="080A0001" w:tentative="1">
-      <w:start w:val="1"/>
-      <w:numFmt w:val="bullet"/>
-      <w:lvlText w:val=""/>
-      <w:lvlJc w:val="left"/>
-      <w:pPr>
-        <w:ind w:left="5040" w:hanging="360"/>
-      </w:pPr>
-      <w:rPr>
-        <w:rFonts w:ascii="Symbol" w:hAnsi="Symbol" w:hint="default"/>
-      </w:rPr>
-    </w:lvl>
-    <w:lvl w:ilvl="7" w:tplc="080A0003" w:tentative="1">
-      <w:start w:val="1"/>
-      <w:numFmt w:val="bullet"/>
-      <w:lvlText w:val="o"/>
-      <w:lvlJc w:val="left"/>
-      <w:pPr>
-        <w:ind w:left="5760" w:hanging="360"/>
-      </w:pPr>
-      <w:rPr>
-        <w:rFonts w:ascii="Courier New" w:hAnsi="Courier New" w:cs="Courier New" w:hint="default"/>
-      </w:rPr>
-    </w:lvl>
-    <w:lvl w:ilvl="8" w:tplc="080A0005" w:tentative="1">
-      <w:start w:val="1"/>
-      <w:numFmt w:val="bullet"/>
-      <w:lvlText w:val=""/>
-      <w:lvlJc w:val="left"/>
-      <w:pPr>
-        <w:ind w:left="6480" w:hanging="360"/>
-      </w:pPr>
-      <w:rPr>
-        <w:rFonts w:ascii="Wingdings" w:hAnsi="Wingdings" w:hint="default"/>
-      </w:rPr>
-    </w:lvl>
-  </w:abstractNum>
-  <w:abstractNum w:abstractNumId="2">
-    <w:nsid w:val="1AE74A1C"/>
-    <w:multiLevelType w:val="hybridMultilevel"/>
-    <w:tmpl w:val="9CA29882"/>
-    <w:lvl w:ilvl="0" w:tplc="240A000F">
-      <w:start w:val="1"/>
-      <w:numFmt w:val="decimal"/>
-      <w:lvlText w:val="%1."/>
-      <w:lvlJc w:val="left"/>
-      <w:pPr>
-        <w:ind w:left="720" w:hanging="360"/>
-      </w:pPr>
-    </w:lvl>
-    <w:lvl w:ilvl="1" w:tplc="240A0019" w:tentative="1">
-      <w:start w:val="1"/>
-      <w:numFmt w:val="lowerLetter"/>
-      <w:lvlText w:val="%2."/>
-      <w:lvlJc w:val="left"/>
-      <w:pPr>
-        <w:ind w:left="1440" w:hanging="360"/>
-      </w:pPr>
-    </w:lvl>
-    <w:lvl w:ilvl="2" w:tplc="240A001B" w:tentative="1">
-      <w:start w:val="1"/>
-      <w:numFmt w:val="lowerRoman"/>
-      <w:lvlText w:val="%3."/>
-      <w:lvlJc w:val="right"/>
-      <w:pPr>
-        <w:ind w:left="2160" w:hanging="180"/>
-      </w:pPr>
-    </w:lvl>
-    <w:lvl w:ilvl="3" w:tplc="240A000F" w:tentative="1">
-      <w:start w:val="1"/>
-      <w:numFmt w:val="decimal"/>
-      <w:lvlText w:val="%4."/>
-      <w:lvlJc w:val="left"/>
-      <w:pPr>
-        <w:ind w:left="2880" w:hanging="360"/>
-      </w:pPr>
-    </w:lvl>
-    <w:lvl w:ilvl="4" w:tplc="240A0019" w:tentative="1">
-      <w:start w:val="1"/>
-      <w:numFmt w:val="lowerLetter"/>
-      <w:lvlText w:val="%5."/>
-      <w:lvlJc w:val="left"/>
-      <w:pPr>
-        <w:ind w:left="3600" w:hanging="360"/>
-      </w:pPr>
-    </w:lvl>
-    <w:lvl w:ilvl="5" w:tplc="240A001B" w:tentative="1">
-      <w:start w:val="1"/>
-      <w:numFmt w:val="lowerRoman"/>
-      <w:lvlText w:val="%6."/>
-      <w:lvlJc w:val="right"/>
-      <w:pPr>
-        <w:ind w:left="4320" w:hanging="180"/>
-      </w:pPr>
-    </w:lvl>
-    <w:lvl w:ilvl="6" w:tplc="240A000F" w:tentative="1">
-      <w:start w:val="1"/>
-      <w:numFmt w:val="decimal"/>
-      <w:lvlText w:val="%7."/>
-      <w:lvlJc w:val="left"/>
-      <w:pPr>
-        <w:ind w:left="5040" w:hanging="360"/>
-      </w:pPr>
-    </w:lvl>
-    <w:lvl w:ilvl="7" w:tplc="240A0019" w:tentative="1">
-      <w:start w:val="1"/>
-      <w:numFmt w:val="lowerLetter"/>
-      <w:lvlText w:val="%8."/>
-      <w:lvlJc w:val="left"/>
-      <w:pPr>
-        <w:ind w:left="5760" w:hanging="360"/>
-      </w:pPr>
-    </w:lvl>
-    <w:lvl w:ilvl="8" w:tplc="240A001B" w:tentative="1">
-      <w:start w:val="1"/>
-      <w:numFmt w:val="lowerRoman"/>
-      <w:lvlText w:val="%9."/>
-      <w:lvlJc w:val="right"/>
-      <w:pPr>
-        <w:ind w:left="6480" w:hanging="180"/>
-      </w:pPr>
-    </w:lvl>
-  </w:abstractNum>
-  <w:abstractNum w:abstractNumId="3">
-    <w:nsid w:val="469C100E"/>
-    <w:multiLevelType w:val="multilevel"/>
-    <w:tmpl w:val="AF70CAB8"/>
-    <w:lvl w:ilvl="0">
-      <w:start w:val="1"/>
-      <w:numFmt w:val="decimal"/>
-      <w:lvlText w:val="%1."/>
-      <w:lvlJc w:val="left"/>
-      <w:pPr>
-        <w:ind w:left="1440" w:hanging="360"/>
-      </w:pPr>
-      <w:rPr>
-        <w:rFonts w:ascii="Arial" w:hAnsi="Arial" w:cs="Arial" w:hint="default"/>
-        <w:color w:val="auto"/>
-        <w:sz w:val="24"/>
-        <w:szCs w:val="24"/>
-      </w:rPr>
-    </w:lvl>
-    <w:lvl w:ilvl="1">
-      <w:start w:val="1"/>
-      <w:numFmt w:val="lowerLetter"/>
-      <w:lvlText w:val="%2."/>
-      <w:lvlJc w:val="left"/>
-      <w:pPr>
-        <w:ind w:left="2160" w:hanging="360"/>
-      </w:pPr>
-    </w:lvl>
-    <w:lvl w:ilvl="2">
-      <w:start w:val="1"/>
-      <w:numFmt w:val="lowerRoman"/>
-      <w:lvlText w:val="%3."/>
-      <w:lvlJc w:val="right"/>
-      <w:pPr>
-        <w:ind w:left="2880" w:hanging="180"/>
-      </w:pPr>
-    </w:lvl>
-    <w:lvl w:ilvl="3">
-      <w:start w:val="1"/>
-      <w:numFmt w:val="decimal"/>
-      <w:lvlText w:val="%4."/>
-      <w:lvlJc w:val="left"/>
-      <w:pPr>
-        <w:ind w:left="3600" w:hanging="360"/>
-      </w:pPr>
-    </w:lvl>
-    <w:lvl w:ilvl="4">
-      <w:start w:val="1"/>
-      <w:numFmt w:val="lowerLetter"/>
-      <w:lvlText w:val="%5."/>
-      <w:lvlJc w:val="left"/>
-      <w:pPr>
-        <w:ind w:left="4320" w:hanging="360"/>
-      </w:pPr>
-    </w:lvl>
-    <w:lvl w:ilvl="5">
-      <w:start w:val="1"/>
-      <w:numFmt w:val="lowerRoman"/>
-      <w:lvlText w:val="%6."/>
-      <w:lvlJc w:val="right"/>
-      <w:pPr>
-        <w:ind w:left="5040" w:hanging="180"/>
-      </w:pPr>
-    </w:lvl>
-    <w:lvl w:ilvl="6">
-      <w:start w:val="1"/>
-      <w:numFmt w:val="decimal"/>
-      <w:lvlText w:val="%7."/>
-      <w:lvlJc w:val="left"/>
-      <w:pPr>
-        <w:ind w:left="5760" w:hanging="360"/>
-      </w:pPr>
-    </w:lvl>
-    <w:lvl w:ilvl="7">
-      <w:start w:val="1"/>
-      <w:numFmt w:val="lowerLetter"/>
-      <w:lvlText w:val="%8."/>
-      <w:lvlJc w:val="left"/>
-      <w:pPr>
-        <w:ind w:left="6480" w:hanging="360"/>
-      </w:pPr>
-    </w:lvl>
-    <w:lvl w:ilvl="8">
-      <w:start w:val="1"/>
-      <w:numFmt w:val="lowerRoman"/>
-      <w:lvlText w:val="%9."/>
-      <w:lvlJc w:val="right"/>
-      <w:pPr>
-        <w:ind w:left="7200" w:hanging="180"/>
-      </w:pPr>
-    </w:lvl>
-  </w:abstractNum>
-  <w:num w:numId="1">
-    <w:abstractNumId w:val="3"/>
-  </w:num>
-  <w:num w:numId="2">
-    <w:abstractNumId w:val="0"/>
-  </w:num>
-  <w:num w:numId="3">
-    <w:abstractNumId w:val="1"/>
-  </w:num>
-  <w:num w:numId="4">
-    <w:abstractNumId w:val="2"/>
-  </w:num>
-</w:numbering>
 </file>
 
 <file path=word/styles.xml><?xml version="1.0" encoding="utf-8"?>
@@ -2045,15 +1849,10 @@
     <w:rPrDefault>
       <w:rPr>
         <w:rFonts w:ascii="Times New Roman" w:eastAsia="Times New Roman" w:hAnsi="Times New Roman" w:cs="Times New Roman"/>
-        <w:lang w:val="es-ES" w:eastAsia="es-ES" w:bidi="ar-SA"/>
+        <w:lang w:val="es" w:eastAsia="es-CO" w:bidi="ar-SA"/>
       </w:rPr>
     </w:rPrDefault>
-    <w:pPrDefault>
-      <w:pPr>
-        <w:autoSpaceDN w:val="0"/>
-        <w:textAlignment w:val="baseline"/>
-      </w:pPr>
-    </w:pPrDefault>
+    <w:pPrDefault/>
   </w:docDefaults>
   <w:latentStyles w:defLockedState="0" w:defUIPriority="99" w:defSemiHidden="1" w:defUnhideWhenUsed="1" w:defQFormat="0" w:count="267">
     <w:lsdException w:name="Normal" w:semiHidden="0" w:uiPriority="0" w:unhideWhenUsed="0" w:qFormat="1"/>
@@ -2079,10 +1878,9 @@
     <w:lsdException w:name="Title" w:semiHidden="0" w:uiPriority="10" w:unhideWhenUsed="0" w:qFormat="1"/>
     <w:lsdException w:name="Default Paragraph Font" w:uiPriority="1"/>
     <w:lsdException w:name="Subtitle" w:semiHidden="0" w:uiPriority="11" w:unhideWhenUsed="0" w:qFormat="1"/>
-    <w:lsdException w:name="Body Text 2" w:uiPriority="0"/>
     <w:lsdException w:name="Strong" w:semiHidden="0" w:uiPriority="22" w:unhideWhenUsed="0" w:qFormat="1"/>
     <w:lsdException w:name="Emphasis" w:semiHidden="0" w:uiPriority="20" w:unhideWhenUsed="0" w:qFormat="1"/>
-    <w:lsdException w:name="Table Grid" w:semiHidden="0" w:uiPriority="39" w:unhideWhenUsed="0"/>
+    <w:lsdException w:name="Table Grid" w:semiHidden="0" w:uiPriority="59" w:unhideWhenUsed="0"/>
     <w:lsdException w:name="Placeholder Text" w:unhideWhenUsed="0"/>
     <w:lsdException w:name="No Spacing" w:semiHidden="0" w:uiPriority="1" w:unhideWhenUsed="0" w:qFormat="1"/>
     <w:lsdException w:name="Light Shading" w:semiHidden="0" w:uiPriority="60" w:unhideWhenUsed="0"/>
@@ -2197,30 +1995,24 @@
   </w:latentStyles>
   <w:style w:type="paragraph" w:default="1" w:styleId="Normal">
     <w:name w:val="Normal"/>
-    <w:rsid w:val="005B1DA9"/>
-    <w:pPr>
-      <w:suppressAutoHyphens/>
-    </w:pPr>
   </w:style>
   <w:style w:type="paragraph" w:styleId="Ttulo1">
     <w:name w:val="heading 1"/>
     <w:basedOn w:val="Normal"/>
     <w:next w:val="Normal"/>
-    <w:rsid w:val="005B1DA9"/>
     <w:pPr>
       <w:keepNext/>
       <w:outlineLvl w:val="0"/>
     </w:pPr>
     <w:rPr>
       <w:sz w:val="24"/>
-      <w:lang w:val="es-CO"/>
+      <w:szCs w:val="24"/>
     </w:rPr>
   </w:style>
   <w:style w:type="paragraph" w:styleId="Ttulo2">
     <w:name w:val="heading 2"/>
     <w:basedOn w:val="Normal"/>
     <w:next w:val="Normal"/>
-    <w:rsid w:val="005B1DA9"/>
     <w:pPr>
       <w:keepNext/>
       <w:jc w:val="center"/>
@@ -2228,14 +2020,13 @@
     </w:pPr>
     <w:rPr>
       <w:sz w:val="24"/>
-      <w:lang w:val="es-CO"/>
+      <w:szCs w:val="24"/>
     </w:rPr>
   </w:style>
   <w:style w:type="paragraph" w:styleId="Ttulo3">
     <w:name w:val="heading 3"/>
     <w:basedOn w:val="Normal"/>
     <w:next w:val="Normal"/>
-    <w:rsid w:val="005B1DA9"/>
     <w:pPr>
       <w:keepNext/>
       <w:spacing w:line="480" w:lineRule="auto"/>
@@ -2244,15 +2035,15 @@
     </w:pPr>
     <w:rPr>
       <w:b/>
+      <w:bCs/>
       <w:sz w:val="32"/>
-      <w:lang w:val="es-CO"/>
+      <w:szCs w:val="32"/>
     </w:rPr>
   </w:style>
   <w:style w:type="paragraph" w:styleId="Ttulo4">
     <w:name w:val="heading 4"/>
     <w:basedOn w:val="Normal"/>
     <w:next w:val="Normal"/>
-    <w:rsid w:val="005B1DA9"/>
     <w:pPr>
       <w:keepNext/>
       <w:spacing w:line="480" w:lineRule="auto"/>
@@ -2261,15 +2052,15 @@
     </w:pPr>
     <w:rPr>
       <w:b/>
+      <w:bCs/>
       <w:sz w:val="24"/>
-      <w:lang w:val="es-CO"/>
+      <w:szCs w:val="24"/>
     </w:rPr>
   </w:style>
   <w:style w:type="paragraph" w:styleId="Ttulo5">
     <w:name w:val="heading 5"/>
     <w:basedOn w:val="Normal"/>
     <w:next w:val="Normal"/>
-    <w:rsid w:val="005B1DA9"/>
     <w:pPr>
       <w:keepNext/>
       <w:spacing w:line="480" w:lineRule="auto"/>
@@ -2277,8 +2068,24 @@
     </w:pPr>
     <w:rPr>
       <w:b/>
+      <w:bCs/>
       <w:sz w:val="24"/>
-      <w:lang w:val="es-CO"/>
+      <w:szCs w:val="24"/>
+    </w:rPr>
+  </w:style>
+  <w:style w:type="paragraph" w:styleId="Ttulo6">
+    <w:name w:val="heading 6"/>
+    <w:basedOn w:val="Normal"/>
+    <w:next w:val="Normal"/>
+    <w:pPr>
+      <w:keepNext/>
+      <w:keepLines/>
+      <w:spacing w:before="200" w:after="40"/>
+      <w:outlineLvl w:val="5"/>
+    </w:pPr>
+    <w:rPr>
+      <w:b/>
+      <w:bCs/>
     </w:rPr>
   </w:style>
   <w:style w:type="character" w:default="1" w:styleId="Fuentedeprrafopredeter">
@@ -2308,160 +2115,56 @@
     <w:semiHidden/>
     <w:unhideWhenUsed/>
   </w:style>
-  <w:style w:type="paragraph" w:styleId="Textoindependiente">
-    <w:name w:val="Body Text"/>
+  <w:style w:type="table" w:customStyle="1" w:styleId="TableNormal">
+    <w:name w:val="TableNormal"/>
+    <w:tblPr>
+      <w:tblCellMar>
+        <w:top w:w="100" w:type="dxa"/>
+        <w:left w:w="100" w:type="dxa"/>
+        <w:bottom w:w="100" w:type="dxa"/>
+        <w:right w:w="100" w:type="dxa"/>
+      </w:tblCellMar>
+    </w:tblPr>
+  </w:style>
+  <w:style w:type="paragraph" w:styleId="Ttulo">
+    <w:name w:val="Title"/>
     <w:basedOn w:val="Normal"/>
-    <w:rsid w:val="005B1DA9"/>
+    <w:next w:val="Normal"/>
     <w:pPr>
-      <w:spacing w:line="480" w:lineRule="auto"/>
+      <w:keepNext/>
+      <w:keepLines/>
+      <w:spacing w:before="480" w:after="120"/>
     </w:pPr>
     <w:rPr>
-      <w:sz w:val="24"/>
-      <w:lang w:val="es-CO"/>
+      <w:b/>
+      <w:bCs/>
+      <w:sz w:val="72"/>
+      <w:szCs w:val="72"/>
     </w:rPr>
   </w:style>
-  <w:style w:type="paragraph" w:styleId="Textoindependiente2">
-    <w:name w:val="Body Text 2"/>
+  <w:style w:type="paragraph" w:styleId="Subttulo">
+    <w:name w:val="Subtitle"/>
     <w:basedOn w:val="Normal"/>
-    <w:rsid w:val="005B1DA9"/>
+    <w:next w:val="Normal"/>
     <w:pPr>
-      <w:spacing w:line="480" w:lineRule="auto"/>
-      <w:jc w:val="both"/>
+      <w:keepNext/>
+      <w:keepLines/>
+      <w:spacing w:before="360" w:after="80"/>
     </w:pPr>
     <w:rPr>
-      <w:sz w:val="24"/>
-      <w:lang w:val="es-CO"/>
+      <w:rFonts w:ascii="Georgia" w:eastAsia="Georgia" w:hAnsi="Georgia" w:cs="Georgia"/>
+      <w:i/>
+      <w:iCs/>
+      <w:color w:val="666666"/>
+      <w:sz w:val="48"/>
+      <w:szCs w:val="48"/>
     </w:rPr>
   </w:style>
-  <w:style w:type="paragraph" w:styleId="Encabezado">
-    <w:name w:val="header"/>
-    <w:basedOn w:val="Normal"/>
-    <w:rsid w:val="005B1DA9"/>
-    <w:pPr>
-      <w:tabs>
-        <w:tab w:val="center" w:pos="4252"/>
-        <w:tab w:val="right" w:pos="8504"/>
-      </w:tabs>
-    </w:pPr>
-  </w:style>
-  <w:style w:type="paragraph" w:styleId="Piedepgina">
-    <w:name w:val="footer"/>
-    <w:basedOn w:val="Normal"/>
-    <w:rsid w:val="005B1DA9"/>
-    <w:pPr>
-      <w:tabs>
-        <w:tab w:val="center" w:pos="4252"/>
-        <w:tab w:val="right" w:pos="8504"/>
-      </w:tabs>
-    </w:pPr>
-  </w:style>
-  <w:style w:type="paragraph" w:styleId="Mapadeldocumento">
-    <w:name w:val="Document Map"/>
-    <w:basedOn w:val="Normal"/>
-    <w:rsid w:val="005B1DA9"/>
-    <w:pPr>
-      <w:shd w:val="clear" w:color="auto" w:fill="000080"/>
-    </w:pPr>
-    <w:rPr>
-      <w:rFonts w:ascii="Tahoma" w:hAnsi="Tahoma" w:cs="Tahoma"/>
-    </w:rPr>
-  </w:style>
-  <w:style w:type="paragraph" w:styleId="Textodeglobo">
-    <w:name w:val="Balloon Text"/>
-    <w:basedOn w:val="Normal"/>
-    <w:rsid w:val="005B1DA9"/>
-    <w:rPr>
-      <w:rFonts w:ascii="Tahoma" w:hAnsi="Tahoma" w:cs="Tahoma"/>
-      <w:sz w:val="16"/>
-      <w:szCs w:val="16"/>
-    </w:rPr>
-  </w:style>
-  <w:style w:type="character" w:styleId="Nmerodepgina">
-    <w:name w:val="page number"/>
-    <w:basedOn w:val="Fuentedeprrafopredeter"/>
-    <w:rsid w:val="005B1DA9"/>
-  </w:style>
-  <w:style w:type="character" w:styleId="Hipervnculo">
-    <w:name w:val="Hyperlink"/>
-    <w:rsid w:val="005B1DA9"/>
-    <w:rPr>
-      <w:color w:val="0000FF"/>
-      <w:u w:val="single"/>
-    </w:rPr>
-  </w:style>
-  <w:style w:type="character" w:customStyle="1" w:styleId="PiedepginaCar">
-    <w:name w:val="Pie de página Car"/>
-    <w:rsid w:val="005B1DA9"/>
-    <w:rPr>
-      <w:lang w:eastAsia="es-ES"/>
-    </w:rPr>
-  </w:style>
-  <w:style w:type="paragraph" w:styleId="Textonotapie">
-    <w:name w:val="footnote text"/>
-    <w:basedOn w:val="Normal"/>
-    <w:rsid w:val="005B1DA9"/>
-  </w:style>
-  <w:style w:type="character" w:customStyle="1" w:styleId="TextonotapieCar">
-    <w:name w:val="Texto nota pie Car"/>
-    <w:rsid w:val="005B1DA9"/>
-    <w:rPr>
-      <w:lang w:eastAsia="es-ES"/>
-    </w:rPr>
-  </w:style>
-  <w:style w:type="character" w:styleId="Refdenotaalpie">
-    <w:name w:val="footnote reference"/>
-    <w:rsid w:val="005B1DA9"/>
-    <w:rPr>
-      <w:position w:val="0"/>
-      <w:vertAlign w:val="superscript"/>
-    </w:rPr>
-  </w:style>
-  <w:style w:type="character" w:customStyle="1" w:styleId="EncabezadoCar">
-    <w:name w:val="Encabezado Car"/>
-    <w:rsid w:val="005B1DA9"/>
-    <w:rPr>
-      <w:lang w:eastAsia="es-ES"/>
-    </w:rPr>
-  </w:style>
-  <w:style w:type="character" w:customStyle="1" w:styleId="Textoindependiente2Car">
-    <w:name w:val="Texto independiente 2 Car"/>
-    <w:basedOn w:val="Fuentedeprrafopredeter"/>
-    <w:rsid w:val="005B1DA9"/>
-    <w:rPr>
-      <w:sz w:val="24"/>
-      <w:lang w:val="es-CO"/>
-    </w:rPr>
-  </w:style>
-  <w:style w:type="paragraph" w:styleId="Prrafodelista">
-    <w:name w:val="List Paragraph"/>
-    <w:basedOn w:val="Normal"/>
-    <w:rsid w:val="005B1DA9"/>
-    <w:pPr>
-      <w:ind w:left="720"/>
-    </w:pPr>
-  </w:style>
-  <w:style w:type="paragraph" w:styleId="Sinespaciado">
-    <w:name w:val="No Spacing"/>
-    <w:rsid w:val="005B1DA9"/>
-    <w:pPr>
-      <w:suppressAutoHyphens/>
-    </w:pPr>
-  </w:style>
-  <w:style w:type="table" w:styleId="Tablaconcuadrcula">
-    <w:name w:val="Table Grid"/>
-    <w:basedOn w:val="Tablanormal"/>
-    <w:uiPriority w:val="39"/>
-    <w:rsid w:val="00667C65"/>
+  <w:style w:type="table" w:customStyle="1" w:styleId="a">
+    <w:basedOn w:val="TableNormal"/>
     <w:tblPr>
-      <w:tblInd w:w="0" w:type="dxa"/>
-      <w:tblBorders>
-        <w:top w:val="single" w:sz="4" w:space="0" w:color="auto"/>
-        <w:left w:val="single" w:sz="4" w:space="0" w:color="auto"/>
-        <w:bottom w:val="single" w:sz="4" w:space="0" w:color="auto"/>
-        <w:right w:val="single" w:sz="4" w:space="0" w:color="auto"/>
-        <w:insideH w:val="single" w:sz="4" w:space="0" w:color="auto"/>
-        <w:insideV w:val="single" w:sz="4" w:space="0" w:color="auto"/>
-      </w:tblBorders>
+      <w:tblStyleRowBandSize w:val="1"/>
+      <w:tblStyleColBandSize w:val="1"/>
       <w:tblCellMar>
         <w:top w:w="0" w:type="dxa"/>
         <w:left w:w="108" w:type="dxa"/>
@@ -2470,119 +2173,69 @@
       </w:tblCellMar>
     </w:tblPr>
   </w:style>
-  <w:style w:type="character" w:styleId="Refdecomentario">
-    <w:name w:val="annotation reference"/>
-    <w:basedOn w:val="Fuentedeprrafopredeter"/>
+  <w:style w:type="table" w:customStyle="1" w:styleId="a0">
+    <w:basedOn w:val="TableNormal"/>
+    <w:tblPr>
+      <w:tblStyleRowBandSize w:val="1"/>
+      <w:tblStyleColBandSize w:val="1"/>
+      <w:tblCellMar>
+        <w:top w:w="0" w:type="dxa"/>
+        <w:left w:w="108" w:type="dxa"/>
+        <w:bottom w:w="0" w:type="dxa"/>
+        <w:right w:w="108" w:type="dxa"/>
+      </w:tblCellMar>
+    </w:tblPr>
+  </w:style>
+  <w:style w:type="table" w:customStyle="1" w:styleId="a1">
+    <w:basedOn w:val="TableNormal"/>
+    <w:tblPr>
+      <w:tblStyleRowBandSize w:val="1"/>
+      <w:tblStyleColBandSize w:val="1"/>
+      <w:tblCellMar>
+        <w:top w:w="0" w:type="dxa"/>
+        <w:left w:w="108" w:type="dxa"/>
+        <w:bottom w:w="0" w:type="dxa"/>
+        <w:right w:w="108" w:type="dxa"/>
+      </w:tblCellMar>
+    </w:tblPr>
+  </w:style>
+  <w:style w:type="table" w:customStyle="1" w:styleId="a2">
+    <w:basedOn w:val="TableNormal"/>
+    <w:tblPr>
+      <w:tblStyleRowBandSize w:val="1"/>
+      <w:tblStyleColBandSize w:val="1"/>
+      <w:tblCellMar>
+        <w:top w:w="0" w:type="dxa"/>
+        <w:bottom w:w="0" w:type="dxa"/>
+      </w:tblCellMar>
+    </w:tblPr>
+  </w:style>
+  <w:style w:type="paragraph" w:styleId="Textodeglobo">
+    <w:name w:val="Balloon Text"/>
+    <w:basedOn w:val="Normal"/>
+    <w:link w:val="TextodegloboCar"/>
     <w:uiPriority w:val="99"/>
     <w:semiHidden/>
     <w:unhideWhenUsed/>
-    <w:rsid w:val="008E436E"/>
+    <w:rsid w:val="002F6A31"/>
     <w:rPr>
+      <w:rFonts w:ascii="Tahoma" w:hAnsi="Tahoma" w:cs="Tahoma"/>
       <w:sz w:val="16"/>
       <w:szCs w:val="16"/>
     </w:rPr>
   </w:style>
-  <w:style w:type="paragraph" w:styleId="Textocomentario">
-    <w:name w:val="annotation text"/>
-    <w:basedOn w:val="Normal"/>
-    <w:link w:val="TextocomentarioCar"/>
+  <w:style w:type="character" w:customStyle="1" w:styleId="TextodegloboCar">
+    <w:name w:val="Texto de globo Car"/>
+    <w:basedOn w:val="Fuentedeprrafopredeter"/>
+    <w:link w:val="Textodeglobo"/>
     <w:uiPriority w:val="99"/>
     <w:semiHidden/>
-    <w:unhideWhenUsed/>
-    <w:rsid w:val="008E436E"/>
-  </w:style>
-  <w:style w:type="character" w:customStyle="1" w:styleId="TextocomentarioCar">
-    <w:name w:val="Texto comentario Car"/>
-    <w:basedOn w:val="Fuentedeprrafopredeter"/>
-    <w:link w:val="Textocomentario"/>
-    <w:uiPriority w:val="99"/>
-    <w:semiHidden/>
-    <w:rsid w:val="008E436E"/>
-  </w:style>
-  <w:style w:type="paragraph" w:styleId="Asuntodelcomentario">
-    <w:name w:val="annotation subject"/>
-    <w:basedOn w:val="Textocomentario"/>
-    <w:next w:val="Textocomentario"/>
-    <w:link w:val="AsuntodelcomentarioCar"/>
-    <w:uiPriority w:val="99"/>
-    <w:semiHidden/>
-    <w:unhideWhenUsed/>
-    <w:rsid w:val="008E436E"/>
+    <w:rsid w:val="002F6A31"/>
     <w:rPr>
-      <w:b/>
-      <w:bCs/>
+      <w:rFonts w:ascii="Tahoma" w:hAnsi="Tahoma" w:cs="Tahoma"/>
+      <w:sz w:val="16"/>
+      <w:szCs w:val="16"/>
     </w:rPr>
-  </w:style>
-  <w:style w:type="character" w:customStyle="1" w:styleId="AsuntodelcomentarioCar">
-    <w:name w:val="Asunto del comentario Car"/>
-    <w:basedOn w:val="TextocomentarioCar"/>
-    <w:link w:val="Asuntodelcomentario"/>
-    <w:uiPriority w:val="99"/>
-    <w:semiHidden/>
-    <w:rsid w:val="008E436E"/>
-    <w:rPr>
-      <w:b/>
-      <w:bCs/>
-    </w:rPr>
-  </w:style>
-  <w:style w:type="character" w:customStyle="1" w:styleId="Ninguno">
-    <w:name w:val="Ninguno"/>
-    <w:rsid w:val="00CE16EC"/>
-    <w:rPr>
-      <w:lang w:val="es-ES_tradnl"/>
-    </w:rPr>
-  </w:style>
-  <w:style w:type="paragraph" w:customStyle="1" w:styleId="Normal1">
-    <w:name w:val="Normal1"/>
-    <w:rsid w:val="00CE16EC"/>
-    <w:pPr>
-      <w:pBdr>
-        <w:top w:val="nil"/>
-        <w:left w:val="nil"/>
-        <w:bottom w:val="nil"/>
-        <w:right w:val="nil"/>
-        <w:between w:val="nil"/>
-        <w:bar w:val="nil"/>
-      </w:pBdr>
-      <w:tabs>
-        <w:tab w:val="left" w:pos="720"/>
-        <w:tab w:val="left" w:pos="1440"/>
-        <w:tab w:val="left" w:pos="2160"/>
-        <w:tab w:val="left" w:pos="2880"/>
-        <w:tab w:val="left" w:pos="3600"/>
-        <w:tab w:val="left" w:pos="4320"/>
-        <w:tab w:val="left" w:pos="5040"/>
-        <w:tab w:val="left" w:pos="5760"/>
-        <w:tab w:val="left" w:pos="6480"/>
-        <w:tab w:val="left" w:pos="7200"/>
-        <w:tab w:val="left" w:pos="7920"/>
-        <w:tab w:val="left" w:pos="8640"/>
-        <w:tab w:val="left" w:pos="9360"/>
-      </w:tabs>
-      <w:autoSpaceDN/>
-      <w:jc w:val="both"/>
-      <w:textAlignment w:val="auto"/>
-    </w:pPr>
-    <w:rPr>
-      <w:rFonts w:ascii="Arial" w:eastAsia="Arial" w:hAnsi="Arial" w:cs="Arial"/>
-      <w:color w:val="000000"/>
-      <w:sz w:val="24"/>
-      <w:szCs w:val="24"/>
-      <w:u w:color="000000"/>
-      <w:bdr w:val="nil"/>
-      <w:lang w:val="es-ES_tradnl"/>
-    </w:rPr>
-  </w:style>
-  <w:style w:type="paragraph" w:styleId="Revisin">
-    <w:name w:val="Revision"/>
-    <w:hidden/>
-    <w:uiPriority w:val="99"/>
-    <w:semiHidden/>
-    <w:rsid w:val="00443A82"/>
-    <w:pPr>
-      <w:autoSpaceDN/>
-      <w:textAlignment w:val="auto"/>
-    </w:pPr>
   </w:style>
 </w:styles>
 </file>
@@ -2593,15 +2246,10 @@
     <w:rPrDefault>
       <w:rPr>
         <w:rFonts w:ascii="Times New Roman" w:eastAsia="Times New Roman" w:hAnsi="Times New Roman" w:cs="Times New Roman"/>
-        <w:lang w:val="es-ES" w:eastAsia="es-ES" w:bidi="ar-SA"/>
+        <w:lang w:val="es" w:eastAsia="es-CO" w:bidi="ar-SA"/>
       </w:rPr>
     </w:rPrDefault>
-    <w:pPrDefault>
-      <w:pPr>
-        <w:autoSpaceDN w:val="0"/>
-        <w:textAlignment w:val="baseline"/>
-      </w:pPr>
-    </w:pPrDefault>
+    <w:pPrDefault/>
   </w:docDefaults>
   <w:latentStyles w:defLockedState="0" w:defUIPriority="99" w:defSemiHidden="1" w:defUnhideWhenUsed="1" w:defQFormat="0" w:count="267">
     <w:lsdException w:name="Normal" w:semiHidden="0" w:uiPriority="0" w:unhideWhenUsed="0" w:qFormat="1"/>
@@ -2627,10 +2275,9 @@
     <w:lsdException w:name="Title" w:semiHidden="0" w:uiPriority="10" w:unhideWhenUsed="0" w:qFormat="1"/>
     <w:lsdException w:name="Default Paragraph Font" w:uiPriority="1"/>
     <w:lsdException w:name="Subtitle" w:semiHidden="0" w:uiPriority="11" w:unhideWhenUsed="0" w:qFormat="1"/>
-    <w:lsdException w:name="Body Text 2" w:uiPriority="0"/>
     <w:lsdException w:name="Strong" w:semiHidden="0" w:uiPriority="22" w:unhideWhenUsed="0" w:qFormat="1"/>
     <w:lsdException w:name="Emphasis" w:semiHidden="0" w:uiPriority="20" w:unhideWhenUsed="0" w:qFormat="1"/>
-    <w:lsdException w:name="Table Grid" w:semiHidden="0" w:uiPriority="39" w:unhideWhenUsed="0"/>
+    <w:lsdException w:name="Table Grid" w:semiHidden="0" w:uiPriority="59" w:unhideWhenUsed="0"/>
     <w:lsdException w:name="Placeholder Text" w:unhideWhenUsed="0"/>
     <w:lsdException w:name="No Spacing" w:semiHidden="0" w:uiPriority="1" w:unhideWhenUsed="0" w:qFormat="1"/>
     <w:lsdException w:name="Light Shading" w:semiHidden="0" w:uiPriority="60" w:unhideWhenUsed="0"/>
@@ -2745,30 +2392,24 @@
   </w:latentStyles>
   <w:style w:type="paragraph" w:default="1" w:styleId="Normal">
     <w:name w:val="Normal"/>
-    <w:rsid w:val="005B1DA9"/>
-    <w:pPr>
-      <w:suppressAutoHyphens/>
-    </w:pPr>
   </w:style>
   <w:style w:type="paragraph" w:styleId="Ttulo1">
     <w:name w:val="heading 1"/>
     <w:basedOn w:val="Normal"/>
     <w:next w:val="Normal"/>
-    <w:rsid w:val="005B1DA9"/>
     <w:pPr>
       <w:keepNext/>
       <w:outlineLvl w:val="0"/>
     </w:pPr>
     <w:rPr>
       <w:sz w:val="24"/>
-      <w:lang w:val="es-CO"/>
+      <w:szCs w:val="24"/>
     </w:rPr>
   </w:style>
   <w:style w:type="paragraph" w:styleId="Ttulo2">
     <w:name w:val="heading 2"/>
     <w:basedOn w:val="Normal"/>
     <w:next w:val="Normal"/>
-    <w:rsid w:val="005B1DA9"/>
     <w:pPr>
       <w:keepNext/>
       <w:jc w:val="center"/>
@@ -2776,14 +2417,13 @@
     </w:pPr>
     <w:rPr>
       <w:sz w:val="24"/>
-      <w:lang w:val="es-CO"/>
+      <w:szCs w:val="24"/>
     </w:rPr>
   </w:style>
   <w:style w:type="paragraph" w:styleId="Ttulo3">
     <w:name w:val="heading 3"/>
     <w:basedOn w:val="Normal"/>
     <w:next w:val="Normal"/>
-    <w:rsid w:val="005B1DA9"/>
     <w:pPr>
       <w:keepNext/>
       <w:spacing w:line="480" w:lineRule="auto"/>
@@ -2792,15 +2432,15 @@
     </w:pPr>
     <w:rPr>
       <w:b/>
+      <w:bCs/>
       <w:sz w:val="32"/>
-      <w:lang w:val="es-CO"/>
+      <w:szCs w:val="32"/>
     </w:rPr>
   </w:style>
   <w:style w:type="paragraph" w:styleId="Ttulo4">
     <w:name w:val="heading 4"/>
     <w:basedOn w:val="Normal"/>
     <w:next w:val="Normal"/>
-    <w:rsid w:val="005B1DA9"/>
     <w:pPr>
       <w:keepNext/>
       <w:spacing w:line="480" w:lineRule="auto"/>
@@ -2809,15 +2449,15 @@
     </w:pPr>
     <w:rPr>
       <w:b/>
+      <w:bCs/>
       <w:sz w:val="24"/>
-      <w:lang w:val="es-CO"/>
+      <w:szCs w:val="24"/>
     </w:rPr>
   </w:style>
   <w:style w:type="paragraph" w:styleId="Ttulo5">
     <w:name w:val="heading 5"/>
     <w:basedOn w:val="Normal"/>
     <w:next w:val="Normal"/>
-    <w:rsid w:val="005B1DA9"/>
     <w:pPr>
       <w:keepNext/>
       <w:spacing w:line="480" w:lineRule="auto"/>
@@ -2825,8 +2465,24 @@
     </w:pPr>
     <w:rPr>
       <w:b/>
+      <w:bCs/>
       <w:sz w:val="24"/>
-      <w:lang w:val="es-CO"/>
+      <w:szCs w:val="24"/>
+    </w:rPr>
+  </w:style>
+  <w:style w:type="paragraph" w:styleId="Ttulo6">
+    <w:name w:val="heading 6"/>
+    <w:basedOn w:val="Normal"/>
+    <w:next w:val="Normal"/>
+    <w:pPr>
+      <w:keepNext/>
+      <w:keepLines/>
+      <w:spacing w:before="200" w:after="40"/>
+      <w:outlineLvl w:val="5"/>
+    </w:pPr>
+    <w:rPr>
+      <w:b/>
+      <w:bCs/>
     </w:rPr>
   </w:style>
   <w:style w:type="character" w:default="1" w:styleId="Fuentedeprrafopredeter">
@@ -2856,160 +2512,56 @@
     <w:semiHidden/>
     <w:unhideWhenUsed/>
   </w:style>
-  <w:style w:type="paragraph" w:styleId="Textoindependiente">
-    <w:name w:val="Body Text"/>
+  <w:style w:type="table" w:customStyle="1" w:styleId="TableNormal">
+    <w:name w:val="TableNormal"/>
+    <w:tblPr>
+      <w:tblCellMar>
+        <w:top w:w="100" w:type="dxa"/>
+        <w:left w:w="100" w:type="dxa"/>
+        <w:bottom w:w="100" w:type="dxa"/>
+        <w:right w:w="100" w:type="dxa"/>
+      </w:tblCellMar>
+    </w:tblPr>
+  </w:style>
+  <w:style w:type="paragraph" w:styleId="Ttulo">
+    <w:name w:val="Title"/>
     <w:basedOn w:val="Normal"/>
-    <w:rsid w:val="005B1DA9"/>
+    <w:next w:val="Normal"/>
     <w:pPr>
-      <w:spacing w:line="480" w:lineRule="auto"/>
+      <w:keepNext/>
+      <w:keepLines/>
+      <w:spacing w:before="480" w:after="120"/>
     </w:pPr>
     <w:rPr>
-      <w:sz w:val="24"/>
-      <w:lang w:val="es-CO"/>
+      <w:b/>
+      <w:bCs/>
+      <w:sz w:val="72"/>
+      <w:szCs w:val="72"/>
     </w:rPr>
   </w:style>
-  <w:style w:type="paragraph" w:styleId="Textoindependiente2">
-    <w:name w:val="Body Text 2"/>
+  <w:style w:type="paragraph" w:styleId="Subttulo">
+    <w:name w:val="Subtitle"/>
     <w:basedOn w:val="Normal"/>
-    <w:rsid w:val="005B1DA9"/>
+    <w:next w:val="Normal"/>
     <w:pPr>
-      <w:spacing w:line="480" w:lineRule="auto"/>
-      <w:jc w:val="both"/>
+      <w:keepNext/>
+      <w:keepLines/>
+      <w:spacing w:before="360" w:after="80"/>
     </w:pPr>
     <w:rPr>
-      <w:sz w:val="24"/>
-      <w:lang w:val="es-CO"/>
+      <w:rFonts w:ascii="Georgia" w:eastAsia="Georgia" w:hAnsi="Georgia" w:cs="Georgia"/>
+      <w:i/>
+      <w:iCs/>
+      <w:color w:val="666666"/>
+      <w:sz w:val="48"/>
+      <w:szCs w:val="48"/>
     </w:rPr>
   </w:style>
-  <w:style w:type="paragraph" w:styleId="Encabezado">
-    <w:name w:val="header"/>
-    <w:basedOn w:val="Normal"/>
-    <w:rsid w:val="005B1DA9"/>
-    <w:pPr>
-      <w:tabs>
-        <w:tab w:val="center" w:pos="4252"/>
-        <w:tab w:val="right" w:pos="8504"/>
-      </w:tabs>
-    </w:pPr>
-  </w:style>
-  <w:style w:type="paragraph" w:styleId="Piedepgina">
-    <w:name w:val="footer"/>
-    <w:basedOn w:val="Normal"/>
-    <w:rsid w:val="005B1DA9"/>
-    <w:pPr>
-      <w:tabs>
-        <w:tab w:val="center" w:pos="4252"/>
-        <w:tab w:val="right" w:pos="8504"/>
-      </w:tabs>
-    </w:pPr>
-  </w:style>
-  <w:style w:type="paragraph" w:styleId="Mapadeldocumento">
-    <w:name w:val="Document Map"/>
-    <w:basedOn w:val="Normal"/>
-    <w:rsid w:val="005B1DA9"/>
-    <w:pPr>
-      <w:shd w:val="clear" w:color="auto" w:fill="000080"/>
-    </w:pPr>
-    <w:rPr>
-      <w:rFonts w:ascii="Tahoma" w:hAnsi="Tahoma" w:cs="Tahoma"/>
-    </w:rPr>
-  </w:style>
-  <w:style w:type="paragraph" w:styleId="Textodeglobo">
-    <w:name w:val="Balloon Text"/>
-    <w:basedOn w:val="Normal"/>
-    <w:rsid w:val="005B1DA9"/>
-    <w:rPr>
-      <w:rFonts w:ascii="Tahoma" w:hAnsi="Tahoma" w:cs="Tahoma"/>
-      <w:sz w:val="16"/>
-      <w:szCs w:val="16"/>
-    </w:rPr>
-  </w:style>
-  <w:style w:type="character" w:styleId="Nmerodepgina">
-    <w:name w:val="page number"/>
-    <w:basedOn w:val="Fuentedeprrafopredeter"/>
-    <w:rsid w:val="005B1DA9"/>
-  </w:style>
-  <w:style w:type="character" w:styleId="Hipervnculo">
-    <w:name w:val="Hyperlink"/>
-    <w:rsid w:val="005B1DA9"/>
-    <w:rPr>
-      <w:color w:val="0000FF"/>
-      <w:u w:val="single"/>
-    </w:rPr>
-  </w:style>
-  <w:style w:type="character" w:customStyle="1" w:styleId="PiedepginaCar">
-    <w:name w:val="Pie de página Car"/>
-    <w:rsid w:val="005B1DA9"/>
-    <w:rPr>
-      <w:lang w:eastAsia="es-ES"/>
-    </w:rPr>
-  </w:style>
-  <w:style w:type="paragraph" w:styleId="Textonotapie">
-    <w:name w:val="footnote text"/>
-    <w:basedOn w:val="Normal"/>
-    <w:rsid w:val="005B1DA9"/>
-  </w:style>
-  <w:style w:type="character" w:customStyle="1" w:styleId="TextonotapieCar">
-    <w:name w:val="Texto nota pie Car"/>
-    <w:rsid w:val="005B1DA9"/>
-    <w:rPr>
-      <w:lang w:eastAsia="es-ES"/>
-    </w:rPr>
-  </w:style>
-  <w:style w:type="character" w:styleId="Refdenotaalpie">
-    <w:name w:val="footnote reference"/>
-    <w:rsid w:val="005B1DA9"/>
-    <w:rPr>
-      <w:position w:val="0"/>
-      <w:vertAlign w:val="superscript"/>
-    </w:rPr>
-  </w:style>
-  <w:style w:type="character" w:customStyle="1" w:styleId="EncabezadoCar">
-    <w:name w:val="Encabezado Car"/>
-    <w:rsid w:val="005B1DA9"/>
-    <w:rPr>
-      <w:lang w:eastAsia="es-ES"/>
-    </w:rPr>
-  </w:style>
-  <w:style w:type="character" w:customStyle="1" w:styleId="Textoindependiente2Car">
-    <w:name w:val="Texto independiente 2 Car"/>
-    <w:basedOn w:val="Fuentedeprrafopredeter"/>
-    <w:rsid w:val="005B1DA9"/>
-    <w:rPr>
-      <w:sz w:val="24"/>
-      <w:lang w:val="es-CO"/>
-    </w:rPr>
-  </w:style>
-  <w:style w:type="paragraph" w:styleId="Prrafodelista">
-    <w:name w:val="List Paragraph"/>
-    <w:basedOn w:val="Normal"/>
-    <w:rsid w:val="005B1DA9"/>
-    <w:pPr>
-      <w:ind w:left="720"/>
-    </w:pPr>
-  </w:style>
-  <w:style w:type="paragraph" w:styleId="Sinespaciado">
-    <w:name w:val="No Spacing"/>
-    <w:rsid w:val="005B1DA9"/>
-    <w:pPr>
-      <w:suppressAutoHyphens/>
-    </w:pPr>
-  </w:style>
-  <w:style w:type="table" w:styleId="Tablaconcuadrcula">
-    <w:name w:val="Table Grid"/>
-    <w:basedOn w:val="Tablanormal"/>
-    <w:uiPriority w:val="39"/>
-    <w:rsid w:val="00667C65"/>
+  <w:style w:type="table" w:customStyle="1" w:styleId="a">
+    <w:basedOn w:val="TableNormal"/>
     <w:tblPr>
-      <w:tblInd w:w="0" w:type="dxa"/>
-      <w:tblBorders>
-        <w:top w:val="single" w:sz="4" w:space="0" w:color="auto"/>
-        <w:left w:val="single" w:sz="4" w:space="0" w:color="auto"/>
-        <w:bottom w:val="single" w:sz="4" w:space="0" w:color="auto"/>
-        <w:right w:val="single" w:sz="4" w:space="0" w:color="auto"/>
-        <w:insideH w:val="single" w:sz="4" w:space="0" w:color="auto"/>
-        <w:insideV w:val="single" w:sz="4" w:space="0" w:color="auto"/>
-      </w:tblBorders>
+      <w:tblStyleRowBandSize w:val="1"/>
+      <w:tblStyleColBandSize w:val="1"/>
       <w:tblCellMar>
         <w:top w:w="0" w:type="dxa"/>
         <w:left w:w="108" w:type="dxa"/>
@@ -3018,125 +2570,75 @@
       </w:tblCellMar>
     </w:tblPr>
   </w:style>
-  <w:style w:type="character" w:styleId="Refdecomentario">
-    <w:name w:val="annotation reference"/>
-    <w:basedOn w:val="Fuentedeprrafopredeter"/>
+  <w:style w:type="table" w:customStyle="1" w:styleId="a0">
+    <w:basedOn w:val="TableNormal"/>
+    <w:tblPr>
+      <w:tblStyleRowBandSize w:val="1"/>
+      <w:tblStyleColBandSize w:val="1"/>
+      <w:tblCellMar>
+        <w:top w:w="0" w:type="dxa"/>
+        <w:left w:w="108" w:type="dxa"/>
+        <w:bottom w:w="0" w:type="dxa"/>
+        <w:right w:w="108" w:type="dxa"/>
+      </w:tblCellMar>
+    </w:tblPr>
+  </w:style>
+  <w:style w:type="table" w:customStyle="1" w:styleId="a1">
+    <w:basedOn w:val="TableNormal"/>
+    <w:tblPr>
+      <w:tblStyleRowBandSize w:val="1"/>
+      <w:tblStyleColBandSize w:val="1"/>
+      <w:tblCellMar>
+        <w:top w:w="0" w:type="dxa"/>
+        <w:left w:w="108" w:type="dxa"/>
+        <w:bottom w:w="0" w:type="dxa"/>
+        <w:right w:w="108" w:type="dxa"/>
+      </w:tblCellMar>
+    </w:tblPr>
+  </w:style>
+  <w:style w:type="table" w:customStyle="1" w:styleId="a2">
+    <w:basedOn w:val="TableNormal"/>
+    <w:tblPr>
+      <w:tblStyleRowBandSize w:val="1"/>
+      <w:tblStyleColBandSize w:val="1"/>
+      <w:tblCellMar>
+        <w:top w:w="0" w:type="dxa"/>
+        <w:bottom w:w="0" w:type="dxa"/>
+      </w:tblCellMar>
+    </w:tblPr>
+  </w:style>
+  <w:style w:type="paragraph" w:styleId="Textodeglobo">
+    <w:name w:val="Balloon Text"/>
+    <w:basedOn w:val="Normal"/>
+    <w:link w:val="TextodegloboCar"/>
     <w:uiPriority w:val="99"/>
     <w:semiHidden/>
     <w:unhideWhenUsed/>
-    <w:rsid w:val="008E436E"/>
+    <w:rsid w:val="002F6A31"/>
     <w:rPr>
+      <w:rFonts w:ascii="Tahoma" w:hAnsi="Tahoma" w:cs="Tahoma"/>
       <w:sz w:val="16"/>
       <w:szCs w:val="16"/>
     </w:rPr>
   </w:style>
-  <w:style w:type="paragraph" w:styleId="Textocomentario">
-    <w:name w:val="annotation text"/>
-    <w:basedOn w:val="Normal"/>
-    <w:link w:val="TextocomentarioCar"/>
+  <w:style w:type="character" w:customStyle="1" w:styleId="TextodegloboCar">
+    <w:name w:val="Texto de globo Car"/>
+    <w:basedOn w:val="Fuentedeprrafopredeter"/>
+    <w:link w:val="Textodeglobo"/>
     <w:uiPriority w:val="99"/>
     <w:semiHidden/>
-    <w:unhideWhenUsed/>
-    <w:rsid w:val="008E436E"/>
-  </w:style>
-  <w:style w:type="character" w:customStyle="1" w:styleId="TextocomentarioCar">
-    <w:name w:val="Texto comentario Car"/>
-    <w:basedOn w:val="Fuentedeprrafopredeter"/>
-    <w:link w:val="Textocomentario"/>
-    <w:uiPriority w:val="99"/>
-    <w:semiHidden/>
-    <w:rsid w:val="008E436E"/>
-  </w:style>
-  <w:style w:type="paragraph" w:styleId="Asuntodelcomentario">
-    <w:name w:val="annotation subject"/>
-    <w:basedOn w:val="Textocomentario"/>
-    <w:next w:val="Textocomentario"/>
-    <w:link w:val="AsuntodelcomentarioCar"/>
-    <w:uiPriority w:val="99"/>
-    <w:semiHidden/>
-    <w:unhideWhenUsed/>
-    <w:rsid w:val="008E436E"/>
+    <w:rsid w:val="002F6A31"/>
     <w:rPr>
-      <w:b/>
-      <w:bCs/>
+      <w:rFonts w:ascii="Tahoma" w:hAnsi="Tahoma" w:cs="Tahoma"/>
+      <w:sz w:val="16"/>
+      <w:szCs w:val="16"/>
     </w:rPr>
-  </w:style>
-  <w:style w:type="character" w:customStyle="1" w:styleId="AsuntodelcomentarioCar">
-    <w:name w:val="Asunto del comentario Car"/>
-    <w:basedOn w:val="TextocomentarioCar"/>
-    <w:link w:val="Asuntodelcomentario"/>
-    <w:uiPriority w:val="99"/>
-    <w:semiHidden/>
-    <w:rsid w:val="008E436E"/>
-    <w:rPr>
-      <w:b/>
-      <w:bCs/>
-    </w:rPr>
-  </w:style>
-  <w:style w:type="character" w:customStyle="1" w:styleId="Ninguno">
-    <w:name w:val="Ninguno"/>
-    <w:rsid w:val="00CE16EC"/>
-    <w:rPr>
-      <w:lang w:val="es-ES_tradnl"/>
-    </w:rPr>
-  </w:style>
-  <w:style w:type="paragraph" w:customStyle="1" w:styleId="Normal1">
-    <w:name w:val="Normal1"/>
-    <w:rsid w:val="00CE16EC"/>
-    <w:pPr>
-      <w:pBdr>
-        <w:top w:val="nil"/>
-        <w:left w:val="nil"/>
-        <w:bottom w:val="nil"/>
-        <w:right w:val="nil"/>
-        <w:between w:val="nil"/>
-        <w:bar w:val="nil"/>
-      </w:pBdr>
-      <w:tabs>
-        <w:tab w:val="left" w:pos="720"/>
-        <w:tab w:val="left" w:pos="1440"/>
-        <w:tab w:val="left" w:pos="2160"/>
-        <w:tab w:val="left" w:pos="2880"/>
-        <w:tab w:val="left" w:pos="3600"/>
-        <w:tab w:val="left" w:pos="4320"/>
-        <w:tab w:val="left" w:pos="5040"/>
-        <w:tab w:val="left" w:pos="5760"/>
-        <w:tab w:val="left" w:pos="6480"/>
-        <w:tab w:val="left" w:pos="7200"/>
-        <w:tab w:val="left" w:pos="7920"/>
-        <w:tab w:val="left" w:pos="8640"/>
-        <w:tab w:val="left" w:pos="9360"/>
-      </w:tabs>
-      <w:autoSpaceDN/>
-      <w:jc w:val="both"/>
-      <w:textAlignment w:val="auto"/>
-    </w:pPr>
-    <w:rPr>
-      <w:rFonts w:ascii="Arial" w:eastAsia="Arial" w:hAnsi="Arial" w:cs="Arial"/>
-      <w:color w:val="000000"/>
-      <w:sz w:val="24"/>
-      <w:szCs w:val="24"/>
-      <w:u w:color="000000"/>
-      <w:bdr w:val="nil"/>
-      <w:lang w:val="es-ES_tradnl"/>
-    </w:rPr>
-  </w:style>
-  <w:style w:type="paragraph" w:styleId="Revisin">
-    <w:name w:val="Revision"/>
-    <w:hidden/>
-    <w:uiPriority w:val="99"/>
-    <w:semiHidden/>
-    <w:rsid w:val="00443A82"/>
-    <w:pPr>
-      <w:autoSpaceDN/>
-      <w:textAlignment w:val="auto"/>
-    </w:pPr>
   </w:style>
 </w:styles>
 </file>
 
 <file path=word/theme/theme1.xml><?xml version="1.0" encoding="utf-8"?>
-<a:theme xmlns:a="http://schemas.openxmlformats.org/drawingml/2006/main" name="Tema de Office">
+<a:theme xmlns:a="http://schemas.openxmlformats.org/drawingml/2006/main" name="Office Theme">
   <a:themeElements>
     <a:clrScheme name="Office">
       <a:dk1>
@@ -3146,39 +2648,39 @@
         <a:sysClr val="window" lastClr="FFFFFF"/>
       </a:lt1>
       <a:dk2>
-        <a:srgbClr val="44546A"/>
+        <a:srgbClr val="1F497D"/>
       </a:dk2>
       <a:lt2>
-        <a:srgbClr val="E7E6E6"/>
+        <a:srgbClr val="EEECE1"/>
       </a:lt2>
       <a:accent1>
-        <a:srgbClr val="5B9BD5"/>
+        <a:srgbClr val="4F81BD"/>
       </a:accent1>
       <a:accent2>
-        <a:srgbClr val="ED7D31"/>
+        <a:srgbClr val="C0504D"/>
       </a:accent2>
       <a:accent3>
-        <a:srgbClr val="A5A5A5"/>
+        <a:srgbClr val="9BBB59"/>
       </a:accent3>
       <a:accent4>
-        <a:srgbClr val="FFC000"/>
+        <a:srgbClr val="8064A2"/>
       </a:accent4>
       <a:accent5>
-        <a:srgbClr val="4472C4"/>
+        <a:srgbClr val="4BACC6"/>
       </a:accent5>
       <a:accent6>
-        <a:srgbClr val="70AD47"/>
+        <a:srgbClr val="F79646"/>
       </a:accent6>
       <a:hlink>
-        <a:srgbClr val="0563C1"/>
+        <a:srgbClr val="0000FF"/>
       </a:hlink>
       <a:folHlink>
-        <a:srgbClr val="954F72"/>
+        <a:srgbClr val="800080"/>
       </a:folHlink>
     </a:clrScheme>
     <a:fontScheme name="Office">
       <a:majorFont>
-        <a:latin typeface="Calibri Light"/>
+        <a:latin typeface="Calibri"/>
         <a:ea typeface=""/>
         <a:cs typeface=""/>
         <a:font script="Jpan" typeface="ＭＳ ゴシック"/>
@@ -3213,7 +2715,7 @@
         <a:font script="Geor" typeface="Sylfaen"/>
       </a:majorFont>
       <a:minorFont>
-        <a:latin typeface="Calibri"/>
+        <a:latin typeface="Cambria"/>
         <a:ea typeface=""/>
         <a:cs typeface=""/>
         <a:font script="Jpan" typeface="ＭＳ 明朝"/>
@@ -3257,153 +2759,200 @@
           <a:gsLst>
             <a:gs pos="0">
               <a:schemeClr val="phClr">
-                <a:lumMod val="110000"/>
-                <a:satMod val="105000"/>
-                <a:tint val="67000"/>
+                <a:tint val="50000"/>
+                <a:satMod val="300000"/>
               </a:schemeClr>
             </a:gs>
-            <a:gs pos="50000">
+            <a:gs pos="35000">
               <a:schemeClr val="phClr">
-                <a:lumMod val="105000"/>
-                <a:satMod val="103000"/>
-                <a:tint val="73000"/>
+                <a:tint val="37000"/>
+                <a:satMod val="300000"/>
               </a:schemeClr>
             </a:gs>
             <a:gs pos="100000">
               <a:schemeClr val="phClr">
-                <a:lumMod val="105000"/>
-                <a:satMod val="109000"/>
-                <a:tint val="81000"/>
+                <a:tint val="15000"/>
+                <a:satMod val="350000"/>
               </a:schemeClr>
             </a:gs>
           </a:gsLst>
-          <a:lin ang="5400000" scaled="0"/>
+          <a:lin ang="16200000" scaled="1"/>
         </a:gradFill>
         <a:gradFill rotWithShape="1">
           <a:gsLst>
             <a:gs pos="0">
               <a:schemeClr val="phClr">
-                <a:satMod val="103000"/>
-                <a:lumMod val="102000"/>
-                <a:tint val="94000"/>
-              </a:schemeClr>
-            </a:gs>
-            <a:gs pos="50000">
-              <a:schemeClr val="phClr">
-                <a:satMod val="110000"/>
-                <a:lumMod val="100000"/>
+                <a:tint val="100000"/>
                 <a:shade val="100000"/>
+                <a:satMod val="130000"/>
               </a:schemeClr>
             </a:gs>
             <a:gs pos="100000">
               <a:schemeClr val="phClr">
-                <a:lumMod val="99000"/>
-                <a:satMod val="120000"/>
-                <a:shade val="78000"/>
+                <a:tint val="50000"/>
+                <a:shade val="100000"/>
+                <a:satMod val="350000"/>
               </a:schemeClr>
             </a:gs>
           </a:gsLst>
-          <a:lin ang="5400000" scaled="0"/>
+          <a:lin ang="16200000" scaled="0"/>
         </a:gradFill>
       </a:fillStyleLst>
       <a:lnStyleLst>
-        <a:ln w="6350" cap="flat" cmpd="sng" algn="ctr">
+        <a:ln w="9525" cap="flat" cmpd="sng" algn="ctr">
+          <a:solidFill>
+            <a:schemeClr val="phClr">
+              <a:shade val="95000"/>
+              <a:satMod val="105000"/>
+            </a:schemeClr>
+          </a:solidFill>
+          <a:prstDash val="solid"/>
+        </a:ln>
+        <a:ln w="25400" cap="flat" cmpd="sng" algn="ctr">
           <a:solidFill>
             <a:schemeClr val="phClr"/>
           </a:solidFill>
           <a:prstDash val="solid"/>
-          <a:miter lim="800000"/>
         </a:ln>
-        <a:ln w="12700" cap="flat" cmpd="sng" algn="ctr">
+        <a:ln w="38100" cap="flat" cmpd="sng" algn="ctr">
           <a:solidFill>
             <a:schemeClr val="phClr"/>
           </a:solidFill>
           <a:prstDash val="solid"/>
-          <a:miter lim="800000"/>
-        </a:ln>
-        <a:ln w="19050" cap="flat" cmpd="sng" algn="ctr">
-          <a:solidFill>
-            <a:schemeClr val="phClr"/>
-          </a:solidFill>
-          <a:prstDash val="solid"/>
-          <a:miter lim="800000"/>
         </a:ln>
       </a:lnStyleLst>
       <a:effectStyleLst>
         <a:effectStyle>
-          <a:effectLst/>
-        </a:effectStyle>
-        <a:effectStyle>
-          <a:effectLst/>
+          <a:effectLst>
+            <a:outerShdw blurRad="40000" dist="20000" dir="5400000" rotWithShape="0">
+              <a:srgbClr val="000000">
+                <a:alpha val="38000"/>
+              </a:srgbClr>
+            </a:outerShdw>
+          </a:effectLst>
         </a:effectStyle>
         <a:effectStyle>
           <a:effectLst>
-            <a:outerShdw blurRad="57150" dist="19050" dir="5400000" algn="ctr" rotWithShape="0">
+            <a:outerShdw blurRad="40000" dist="23000" dir="5400000" rotWithShape="0">
               <a:srgbClr val="000000">
-                <a:alpha val="63000"/>
+                <a:alpha val="35000"/>
               </a:srgbClr>
             </a:outerShdw>
           </a:effectLst>
+        </a:effectStyle>
+        <a:effectStyle>
+          <a:effectLst>
+            <a:outerShdw blurRad="40000" dist="23000" dir="5400000" rotWithShape="0">
+              <a:srgbClr val="000000">
+                <a:alpha val="35000"/>
+              </a:srgbClr>
+            </a:outerShdw>
+          </a:effectLst>
+          <a:scene3d>
+            <a:camera prst="orthographicFront">
+              <a:rot lat="0" lon="0" rev="0"/>
+            </a:camera>
+            <a:lightRig rig="threePt" dir="t">
+              <a:rot lat="0" lon="0" rev="1200000"/>
+            </a:lightRig>
+          </a:scene3d>
+          <a:sp3d>
+            <a:bevelT w="63500" h="25400"/>
+          </a:sp3d>
         </a:effectStyle>
       </a:effectStyleLst>
       <a:bgFillStyleLst>
         <a:solidFill>
           <a:schemeClr val="phClr"/>
         </a:solidFill>
-        <a:solidFill>
-          <a:schemeClr val="phClr">
-            <a:tint val="95000"/>
-            <a:satMod val="170000"/>
-          </a:schemeClr>
-        </a:solidFill>
         <a:gradFill rotWithShape="1">
           <a:gsLst>
             <a:gs pos="0">
               <a:schemeClr val="phClr">
-                <a:tint val="93000"/>
-                <a:satMod val="150000"/>
-                <a:shade val="98000"/>
-                <a:lumMod val="102000"/>
+                <a:tint val="40000"/>
+                <a:satMod val="350000"/>
               </a:schemeClr>
             </a:gs>
-            <a:gs pos="50000">
+            <a:gs pos="40000">
               <a:schemeClr val="phClr">
-                <a:tint val="98000"/>
-                <a:satMod val="130000"/>
-                <a:shade val="90000"/>
-                <a:lumMod val="103000"/>
+                <a:tint val="45000"/>
+                <a:shade val="99000"/>
+                <a:satMod val="350000"/>
               </a:schemeClr>
             </a:gs>
             <a:gs pos="100000">
               <a:schemeClr val="phClr">
-                <a:shade val="63000"/>
-                <a:satMod val="120000"/>
+                <a:shade val="20000"/>
+                <a:satMod val="255000"/>
               </a:schemeClr>
             </a:gs>
           </a:gsLst>
-          <a:lin ang="5400000" scaled="0"/>
+          <a:path path="circle">
+            <a:fillToRect l="50000" t="-80000" r="50000" b="180000"/>
+          </a:path>
+        </a:gradFill>
+        <a:gradFill rotWithShape="1">
+          <a:gsLst>
+            <a:gs pos="0">
+              <a:schemeClr val="phClr">
+                <a:tint val="80000"/>
+                <a:satMod val="300000"/>
+              </a:schemeClr>
+            </a:gs>
+            <a:gs pos="100000">
+              <a:schemeClr val="phClr">
+                <a:shade val="30000"/>
+                <a:satMod val="200000"/>
+              </a:schemeClr>
+            </a:gs>
+          </a:gsLst>
+          <a:path path="circle">
+            <a:fillToRect l="50000" t="50000" r="50000" b="50000"/>
+          </a:path>
         </a:gradFill>
       </a:bgFillStyleLst>
     </a:fmtScheme>
   </a:themeElements>
-  <a:objectDefaults/>
+  <a:objectDefaults>
+    <a:spDef>
+      <a:spPr/>
+      <a:bodyPr/>
+      <a:lstStyle/>
+      <a:style>
+        <a:lnRef idx="1">
+          <a:schemeClr val="accent1"/>
+        </a:lnRef>
+        <a:fillRef idx="3">
+          <a:schemeClr val="accent1"/>
+        </a:fillRef>
+        <a:effectRef idx="2">
+          <a:schemeClr val="accent1"/>
+        </a:effectRef>
+        <a:fontRef idx="minor">
+          <a:schemeClr val="lt1"/>
+        </a:fontRef>
+      </a:style>
+    </a:spDef>
+    <a:lnDef>
+      <a:spPr/>
+      <a:bodyPr/>
+      <a:lstStyle/>
+      <a:style>
+        <a:lnRef idx="2">
+          <a:schemeClr val="accent1"/>
+        </a:lnRef>
+        <a:fillRef idx="0">
+          <a:schemeClr val="accent1"/>
+        </a:fillRef>
+        <a:effectRef idx="1">
+          <a:schemeClr val="accent1"/>
+        </a:effectRef>
+        <a:fontRef idx="minor">
+          <a:schemeClr val="tx1"/>
+        </a:fontRef>
+      </a:style>
+    </a:lnDef>
+  </a:objectDefaults>
   <a:extraClrSchemeLst/>
-  <a:extLst>
-    <a:ext uri="{05A4C25C-085E-4340-85A3-A5531E510DB2}">
-      <thm15:themeFamily xmlns="" xmlns:thm15="http://schemas.microsoft.com/office/thememl/2012/main" name="Office Theme" id="{62F939B6-93AF-4DB8-9C6B-D6C7DFDC589F}" vid="{4A3C46E8-61CC-4603-A589-7422A47A8E4A}"/>
-    </a:ext>
-  </a:extLst>
 </a:theme>
-</file>
-
-<file path=customXml/item1.xml><?xml version="1.0" encoding="utf-8"?>
-<b:Sources xmlns:b="http://schemas.openxmlformats.org/officeDocument/2006/bibliography" xmlns="http://schemas.openxmlformats.org/officeDocument/2006/bibliography" SelectedStyle="\APA.XSL" StyleName="APA"/>
-</file>
-
-<file path=customXml/itemProps1.xml><?xml version="1.0" encoding="utf-8"?>
-<ds:datastoreItem xmlns:ds="http://schemas.openxmlformats.org/officeDocument/2006/customXml" ds:itemID="{C69D8E0F-FEC3-43B9-8FD3-600FB750765D}">
-  <ds:schemaRefs>
-    <ds:schemaRef ds:uri="http://schemas.openxmlformats.org/officeDocument/2006/bibliography"/>
-  </ds:schemaRefs>
-</ds:datastoreItem>
 </file>
</xml_diff>